<commit_message>
rewrote the Currently Used Deprecated Functions secondary document
</commit_message>
<xml_diff>
--- a/source/reference_documents/secondary_documents/implementation phase/Currently Used Deprecated Functions Document/Currently Used Deprecated Functions Document.docx
+++ b/source/reference_documents/secondary_documents/implementation phase/Currently Used Deprecated Functions Document/Currently Used Deprecated Functions Document.docx
@@ -1,6 +1,6 @@
 
 <file path=word/document.xml><?xml version="1.0" encoding="utf-8"?>
-<w:document xmlns:wpc="http://schemas.microsoft.com/office/word/2010/wordprocessingCanvas" xmlns:cx="http://schemas.microsoft.com/office/drawing/2014/chartex" xmlns:cx1="http://schemas.microsoft.com/office/drawing/2015/9/8/chartex" xmlns:cx2="http://schemas.microsoft.com/office/drawing/2015/10/21/chartex" xmlns:cx3="http://schemas.microsoft.com/office/drawing/2016/5/9/chartex" xmlns:cx4="http://schemas.microsoft.com/office/drawing/2016/5/10/chartex" xmlns:cx5="http://schemas.microsoft.com/office/drawing/2016/5/11/chartex" xmlns:cx6="http://schemas.microsoft.com/office/drawing/2016/5/12/chartex" xmlns:cx7="http://schemas.microsoft.com/office/drawing/2016/5/13/chartex" xmlns:cx8="http://schemas.microsoft.com/office/drawing/2016/5/14/chartex" xmlns:mc="http://schemas.openxmlformats.org/markup-compatibility/2006" xmlns:aink="http://schemas.microsoft.com/office/drawing/2016/ink" xmlns:am3d="http://schemas.microsoft.com/office/drawing/2017/model3d" xmlns:o="urn:schemas-microsoft-com:office:office" xmlns:oel="http://schemas.microsoft.com/office/2019/extlst" xmlns:r="http://schemas.openxmlformats.org/officeDocument/2006/relationships" xmlns:m="http://schemas.openxmlformats.org/officeDocument/2006/math" xmlns:v="urn:schemas-microsoft-com:vml" xmlns:wp14="http://schemas.microsoft.com/office/word/2010/wordprocessingDrawing" xmlns:wp="http://schemas.openxmlformats.org/drawingml/2006/wordprocessingDrawing" xmlns:w10="urn:schemas-microsoft-com:office:word" xmlns:w="http://schemas.openxmlformats.org/wordprocessingml/2006/main" xmlns:w14="http://schemas.microsoft.com/office/word/2010/wordml" xmlns:w15="http://schemas.microsoft.com/office/word/2012/wordml" xmlns:w16cex="http://schemas.microsoft.com/office/word/2018/wordml/cex" xmlns:w16cid="http://schemas.microsoft.com/office/word/2016/wordml/cid" xmlns:w16="http://schemas.microsoft.com/office/word/2018/wordml" xmlns:w16sdtdh="http://schemas.microsoft.com/office/word/2020/wordml/sdtdatahash" xmlns:w16se="http://schemas.microsoft.com/office/word/2015/wordml/symex" xmlns:wpg="http://schemas.microsoft.com/office/word/2010/wordprocessingGroup" xmlns:wpi="http://schemas.microsoft.com/office/word/2010/wordprocessingInk" xmlns:wne="http://schemas.microsoft.com/office/word/2006/wordml" xmlns:wps="http://schemas.microsoft.com/office/word/2010/wordprocessingShape" mc:Ignorable="w14 w15 w16se w16cid w16 w16cex w16sdtdh wp14">
+<w:document xmlns:wpc="http://schemas.microsoft.com/office/word/2010/wordprocessingCanvas" xmlns:cx="http://schemas.microsoft.com/office/drawing/2014/chartex" xmlns:cx1="http://schemas.microsoft.com/office/drawing/2015/9/8/chartex" xmlns:cx2="http://schemas.microsoft.com/office/drawing/2015/10/21/chartex" xmlns:cx3="http://schemas.microsoft.com/office/drawing/2016/5/9/chartex" xmlns:cx4="http://schemas.microsoft.com/office/drawing/2016/5/10/chartex" xmlns:cx5="http://schemas.microsoft.com/office/drawing/2016/5/11/chartex" xmlns:cx6="http://schemas.microsoft.com/office/drawing/2016/5/12/chartex" xmlns:cx7="http://schemas.microsoft.com/office/drawing/2016/5/13/chartex" xmlns:cx8="http://schemas.microsoft.com/office/drawing/2016/5/14/chartex" xmlns:mc="http://schemas.openxmlformats.org/markup-compatibility/2006" xmlns:aink="http://schemas.microsoft.com/office/drawing/2016/ink" xmlns:am3d="http://schemas.microsoft.com/office/drawing/2017/model3d" xmlns:o="urn:schemas-microsoft-com:office:office" xmlns:oel="http://schemas.microsoft.com/office/2019/extlst" xmlns:r="http://schemas.openxmlformats.org/officeDocument/2006/relationships" xmlns:m="http://schemas.openxmlformats.org/officeDocument/2006/math" xmlns:v="urn:schemas-microsoft-com:vml" xmlns:wp14="http://schemas.microsoft.com/office/word/2010/wordprocessingDrawing" xmlns:wp="http://schemas.openxmlformats.org/drawingml/2006/wordprocessingDrawing" xmlns:w10="urn:schemas-microsoft-com:office:word" xmlns:w="http://schemas.openxmlformats.org/wordprocessingml/2006/main" xmlns:w14="http://schemas.microsoft.com/office/word/2010/wordml" xmlns:w15="http://schemas.microsoft.com/office/word/2012/wordml" xmlns:w16cex="http://schemas.microsoft.com/office/word/2018/wordml/cex" xmlns:w16cid="http://schemas.microsoft.com/office/word/2016/wordml/cid" xmlns:w16="http://schemas.microsoft.com/office/word/2018/wordml" xmlns:w16du="http://schemas.microsoft.com/office/word/2023/wordml/word16du" xmlns:w16sdtdh="http://schemas.microsoft.com/office/word/2020/wordml/sdtdatahash" xmlns:w16sdtfl="http://schemas.microsoft.com/office/word/2024/wordml/sdtformatlock" xmlns:w16se="http://schemas.microsoft.com/office/word/2015/wordml/symex" xmlns:wpg="http://schemas.microsoft.com/office/word/2010/wordprocessingGroup" xmlns:wpi="http://schemas.microsoft.com/office/word/2010/wordprocessingInk" xmlns:wne="http://schemas.microsoft.com/office/word/2006/wordml" xmlns:wps="http://schemas.microsoft.com/office/word/2010/wordprocessingShape" mc:Ignorable="w14 w15 w16se w16cid w16 w16cex w16sdtdh w16sdtfl w16du wp14">
   <w:body>
     <w:p>
       <w:pPr>
@@ -28,7 +28,7 @@
         <w:t xml:space="preserve">Version </w:t>
       </w:r>
       <w:r>
-        <w:t>4</w:t>
+        <w:t>5</w:t>
       </w:r>
     </w:p>
     <w:p>
@@ -45,7 +45,7 @@
         <w:rPr>
           <w:noProof/>
         </w:rPr>
-        <w:t>9/8/23 12:20 PM</w:t>
+        <w:t>2/25/26 8:23 AM</w:t>
       </w:r>
       <w:r>
         <w:fldChar w:fldCharType="end"/>
@@ -70,7 +70,7 @@
         <w:rPr>
           <w:color w:val="000000" w:themeColor="text1"/>
         </w:rPr>
-        <w:t>Garth Scheidemantel</w:t>
+        <w:t>Charles Wilson</w:t>
       </w:r>
     </w:p>
     <w:p>
@@ -92,10 +92,28 @@
         <w:t>process</w:t>
       </w:r>
       <w:r>
-        <w:t xml:space="preserve"> to </w:t>
-      </w:r>
-      <w:r>
-        <w:t>document the deprecated functions still in use</w:t>
+        <w:t xml:space="preserve"> </w:t>
+      </w:r>
+      <w:r>
+        <w:t>of</w:t>
+      </w:r>
+      <w:r>
+        <w:t xml:space="preserve"> </w:t>
+      </w:r>
+      <w:r>
+        <w:t>document</w:t>
+      </w:r>
+      <w:r>
+        <w:t>ing</w:t>
+      </w:r>
+      <w:r>
+        <w:t xml:space="preserve"> </w:t>
+      </w:r>
+      <w:r>
+        <w:t xml:space="preserve">in-use </w:t>
+      </w:r>
+      <w:r>
+        <w:t>deprecated functions</w:t>
       </w:r>
       <w:r>
         <w:t>.</w:t>
@@ -139,13 +157,14 @@
     </w:p>
     <w:p>
       <w:pPr>
+        <w:spacing w:after="240"/>
         <w:jc w:val="both"/>
       </w:pPr>
       <w:r>
-        <w:t xml:space="preserve">This document is motivated by the need to have formal processes in place to </w:t>
-      </w:r>
-      <w:r>
-        <w:t>track outstanding use of deprecated (unsafe) function</w:t>
+        <w:t xml:space="preserve">This document is motivated by the need to </w:t>
+      </w:r>
+      <w:r>
+        <w:t>track use of deprecated (unsafe) function</w:t>
       </w:r>
       <w:r>
         <w:t>s</w:t>
@@ -160,28 +179,41 @@
         <w:t>systems</w:t>
       </w:r>
       <w:r>
-        <w:t xml:space="preserve"> for certification of compliance to standards such as </w:t>
-      </w:r>
-      <w:r>
-        <w:rPr>
-          <w:b/>
-          <w:bCs/>
-        </w:rPr>
-        <w:t>ISO</w:t>
-      </w:r>
-      <w:r>
-        <w:rPr>
-          <w:b/>
-          <w:bCs/>
-        </w:rPr>
-        <w:t>/SAE</w:t>
-      </w:r>
-      <w:r>
-        <w:rPr>
-          <w:b/>
-          <w:bCs/>
-        </w:rPr>
-        <w:t xml:space="preserve"> 21434</w:t>
+        <w:t>.</w:t>
+      </w:r>
+    </w:p>
+    <w:p>
+      <w:pPr>
+        <w:pStyle w:val="Note"/>
+      </w:pPr>
+      <w:bookmarkStart w:id="4" w:name="_f5diy2ktdyyf" w:colFirst="0" w:colLast="0"/>
+      <w:bookmarkEnd w:id="4"/>
+      <w:r>
+        <w:rPr>
+          <w:b/>
+          <w:bCs/>
+          <w:color w:val="0070C0"/>
+        </w:rPr>
+        <w:t>Note:</w:t>
+      </w:r>
+      <w:r>
+        <w:tab/>
+        <w:t xml:space="preserve">Within the </w:t>
+      </w:r>
+      <w:r>
+        <w:t>context</w:t>
+      </w:r>
+      <w:r>
+        <w:t xml:space="preserve"> of this document, the terms </w:t>
+      </w:r>
+      <w:r>
+        <w:rPr>
+          <w:b/>
+          <w:bCs/>
+          <w:i/>
+          <w:iCs/>
+        </w:rPr>
+        <w:t>security</w:t>
       </w:r>
       <w:r>
         <w:t xml:space="preserve"> and </w:t>
@@ -190,15 +222,46 @@
         <w:rPr>
           <w:b/>
           <w:bCs/>
-        </w:rPr>
-        <w:t xml:space="preserve">ISO </w:t>
-      </w:r>
-      <w:r>
-        <w:rPr>
-          <w:b/>
-          <w:bCs/>
-        </w:rPr>
-        <w:t>26262</w:t>
+          <w:i/>
+          <w:iCs/>
+        </w:rPr>
+        <w:t>cybersecurity</w:t>
+      </w:r>
+      <w:r>
+        <w:t xml:space="preserve"> are used interchangeably. It is presumed that the term </w:t>
+      </w:r>
+      <w:r>
+        <w:rPr>
+          <w:b/>
+          <w:bCs/>
+          <w:i/>
+          <w:iCs/>
+        </w:rPr>
+        <w:t>security</w:t>
+      </w:r>
+      <w:r>
+        <w:t xml:space="preserve"> is being used in reference to </w:t>
+      </w:r>
+      <w:r>
+        <w:rPr>
+          <w:b/>
+          <w:bCs/>
+          <w:i/>
+          <w:iCs/>
+        </w:rPr>
+        <w:t>cybersecurity</w:t>
+      </w:r>
+      <w:r>
+        <w:t xml:space="preserve"> and not </w:t>
+      </w:r>
+      <w:r>
+        <w:rPr>
+          <w:b/>
+          <w:bCs/>
+          <w:i/>
+          <w:iCs/>
+        </w:rPr>
+        <w:t>physical security</w:t>
       </w:r>
       <w:r>
         <w:t>.</w:t>
@@ -209,8 +272,6 @@
         <w:pStyle w:val="Heading1"/>
         <w:jc w:val="both"/>
       </w:pPr>
-      <w:bookmarkStart w:id="4" w:name="_f5diy2ktdyyf" w:colFirst="0" w:colLast="0"/>
-      <w:bookmarkEnd w:id="4"/>
       <w:r>
         <w:t>License</w:t>
       </w:r>
@@ -229,14 +290,26 @@
         <w:rPr>
           <w:lang w:val="en-US"/>
         </w:rPr>
-        <w:t xml:space="preserve">was created by </w:t>
-      </w:r>
-      <w:r>
-        <w:rPr>
-          <w:b/>
-          <w:bCs/>
+        <w:t>was</w:t>
+      </w:r>
+      <w:r>
+        <w:rPr>
           <w:lang w:val="en-US"/>
         </w:rPr>
+        <w:t xml:space="preserve"> originally</w:t>
+      </w:r>
+      <w:r>
+        <w:rPr>
+          <w:lang w:val="en-US"/>
+        </w:rPr>
+        <w:t xml:space="preserve"> created by </w:t>
+      </w:r>
+      <w:r>
+        <w:rPr>
+          <w:b/>
+          <w:bCs/>
+          <w:lang w:val="en-US"/>
+        </w:rPr>
         <w:t>Motional</w:t>
       </w:r>
       <w:r>
@@ -257,7 +330,39 @@
           <w:bCs/>
           <w:lang w:val="en-US"/>
         </w:rPr>
-        <w:t>Creative Commons Attribution-Share Alike (CC4-SA)</w:t>
+        <w:t>Creative Commons Attribution-Share Alike (CC</w:t>
+      </w:r>
+      <w:r>
+        <w:rPr>
+          <w:b/>
+          <w:bCs/>
+          <w:lang w:val="en-US"/>
+        </w:rPr>
+        <w:t xml:space="preserve"> BY-</w:t>
+      </w:r>
+      <w:r>
+        <w:rPr>
+          <w:b/>
+          <w:bCs/>
+          <w:lang w:val="en-US"/>
+        </w:rPr>
+        <w:t>SA</w:t>
+      </w:r>
+      <w:r>
+        <w:rPr>
+          <w:b/>
+          <w:bCs/>
+          <w:lang w:val="en-US"/>
+        </w:rPr>
+        <w:t>-4.0</w:t>
+      </w:r>
+      <w:r>
+        <w:rPr>
+          <w:b/>
+          <w:bCs/>
+          <w:lang w:val="en-US"/>
+        </w:rPr>
+        <w:t>)</w:t>
       </w:r>
       <w:r>
         <w:rPr>
@@ -312,16 +417,70 @@
         <w:jc w:val="both"/>
       </w:pPr>
       <w:r>
-        <w:t xml:space="preserve">Many commonly used functions and APIs are not secure in the face of the current threat environment. </w:t>
-      </w:r>
-      <w:r>
-        <w:t>As these present an ongoing threat to security, they should be replaced with secure alternatives where possible</w:t>
+        <w:t>Over time</w:t>
+      </w:r>
+      <w:r>
+        <w:t xml:space="preserve"> </w:t>
+      </w:r>
+      <w:r>
+        <w:t xml:space="preserve">library </w:t>
+      </w:r>
+      <w:r>
+        <w:t xml:space="preserve">functions </w:t>
+      </w:r>
+      <w:r>
+        <w:t>may be determined to be insecure (unsafe)</w:t>
+      </w:r>
+      <w:r>
+        <w:t xml:space="preserve">. </w:t>
+      </w:r>
+      <w:r>
+        <w:t>Where possible t</w:t>
+      </w:r>
+      <w:r>
+        <w:t>hese</w:t>
+      </w:r>
+      <w:r>
+        <w:t xml:space="preserve"> should be replaced with secure alternative</w:t>
+      </w:r>
+      <w:r>
+        <w:t>s</w:t>
       </w:r>
       <w:r>
         <w:t>.</w:t>
       </w:r>
       <w:r>
-        <w:t xml:space="preserve"> In order to be able to assess the overall risk presented by their continued use, they should be documented, and their presence justified.</w:t>
+        <w:t xml:space="preserve"> In order to assess the overall risk presented by </w:t>
+      </w:r>
+      <w:r>
+        <w:t>those</w:t>
+      </w:r>
+      <w:r>
+        <w:t xml:space="preserve"> </w:t>
+      </w:r>
+      <w:r>
+        <w:t>which cannot be replaced</w:t>
+      </w:r>
+      <w:r>
+        <w:t xml:space="preserve">, they </w:t>
+      </w:r>
+      <w:r>
+        <w:t>must</w:t>
+      </w:r>
+      <w:r>
+        <w:t xml:space="preserve"> be documented, and their</w:t>
+      </w:r>
+      <w:r>
+        <w:t xml:space="preserve"> continued</w:t>
+      </w:r>
+      <w:r>
+        <w:t xml:space="preserve"> </w:t>
+      </w:r>
+      <w:r>
+        <w:t>use</w:t>
+      </w:r>
+      <w:r>
+        <w:t xml:space="preserve"> justified.</w:t>
       </w:r>
     </w:p>
     <w:p>
@@ -345,9 +504,9 @@
           <w:noProof/>
         </w:rPr>
         <w:drawing>
-          <wp:inline distT="0" distB="0" distL="0" distR="0" wp14:anchorId="415B7DAB" wp14:editId="3908B6A5">
-            <wp:extent cx="5931192" cy="2417577"/>
-            <wp:effectExtent l="0" t="0" r="0" b="0"/>
+          <wp:inline distT="0" distB="0" distL="0" distR="0" wp14:anchorId="415B7DAB" wp14:editId="30849A1A">
+            <wp:extent cx="5931192" cy="1747491"/>
+            <wp:effectExtent l="0" t="0" r="0" b="5715"/>
             <wp:docPr id="1" name="Picture 1"/>
             <wp:cNvGraphicFramePr>
               <a:graphicFrameLocks xmlns:a="http://schemas.openxmlformats.org/drawingml/2006/main" noChangeAspect="1"/>
@@ -360,7 +519,7 @@
                     <pic:cNvPicPr/>
                   </pic:nvPicPr>
                   <pic:blipFill>
-                    <a:blip r:embed="rId8">
+                    <a:blip r:embed="rId8" cstate="print">
                       <a:extLst>
                         <a:ext uri="{28A0092B-C50C-407E-A947-70E740481C1C}">
                           <a14:useLocalDpi xmlns:a14="http://schemas.microsoft.com/office/drawing/2010/main" val="0"/>
@@ -374,7 +533,7 @@
                   <pic:spPr>
                     <a:xfrm>
                       <a:off x="0" y="0"/>
-                      <a:ext cx="5931192" cy="2417577"/>
+                      <a:ext cx="5931192" cy="1747491"/>
                     </a:xfrm>
                     <a:prstGeom prst="rect">
                       <a:avLst/>
@@ -412,12 +571,21 @@
         <w:pStyle w:val="Heading2"/>
       </w:pPr>
       <w:r>
-        <w:t>Catalog Deprecated Functions</w:t>
+        <w:t>Identify</w:t>
+      </w:r>
+      <w:r>
+        <w:t xml:space="preserve"> </w:t>
+      </w:r>
+      <w:r>
+        <w:t xml:space="preserve">Deprecated </w:t>
+      </w:r>
+      <w:r>
+        <w:t>Functions</w:t>
       </w:r>
     </w:p>
     <w:tbl>
       <w:tblPr>
-        <w:tblW w:w="4940" w:type="dxa"/>
+        <w:tblW w:w="5480" w:type="dxa"/>
         <w:tblBorders>
           <w:top w:val="single" w:sz="8" w:space="0" w:color="000000"/>
           <w:left w:val="single" w:sz="8" w:space="0" w:color="000000"/>
@@ -431,13 +599,12 @@
       </w:tblPr>
       <w:tblGrid>
         <w:gridCol w:w="1520"/>
-        <w:gridCol w:w="3420"/>
+        <w:gridCol w:w="3960"/>
       </w:tblGrid>
       <w:tr>
         <w:tc>
           <w:tcPr>
             <w:tcW w:w="1520" w:type="dxa"/>
-            <w:shd w:val="clear" w:color="auto" w:fill="auto"/>
             <w:tcMar>
               <w:top w:w="100" w:type="dxa"/>
               <w:left w:w="100" w:type="dxa"/>
@@ -474,8 +641,7 @@
         </w:tc>
         <w:tc>
           <w:tcPr>
-            <w:tcW w:w="3420" w:type="dxa"/>
-            <w:shd w:val="clear" w:color="auto" w:fill="auto"/>
+            <w:tcW w:w="3960" w:type="dxa"/>
             <w:tcMar>
               <w:top w:w="100" w:type="dxa"/>
               <w:left w:w="100" w:type="dxa"/>
@@ -498,6 +664,9 @@
             <w:r>
               <w:t>Authoritative source</w:t>
             </w:r>
+            <w:r>
+              <w:t>s</w:t>
+            </w:r>
           </w:p>
         </w:tc>
       </w:tr>
@@ -505,7 +674,6 @@
         <w:tc>
           <w:tcPr>
             <w:tcW w:w="1520" w:type="dxa"/>
-            <w:shd w:val="clear" w:color="auto" w:fill="auto"/>
             <w:tcMar>
               <w:top w:w="100" w:type="dxa"/>
               <w:left w:w="100" w:type="dxa"/>
@@ -542,8 +710,7 @@
         </w:tc>
         <w:tc>
           <w:tcPr>
-            <w:tcW w:w="3420" w:type="dxa"/>
-            <w:shd w:val="clear" w:color="auto" w:fill="auto"/>
+            <w:tcW w:w="3960" w:type="dxa"/>
             <w:tcMar>
               <w:top w:w="100" w:type="dxa"/>
               <w:left w:w="100" w:type="dxa"/>
@@ -564,7 +731,7 @@
               <w:spacing w:line="240" w:lineRule="auto"/>
             </w:pPr>
             <w:r>
-              <w:t>Deprecated functions database</w:t>
+              <w:t>Deprecated functions</w:t>
             </w:r>
           </w:p>
           <w:p>
@@ -580,7 +747,10 @@
               <w:spacing w:line="240" w:lineRule="auto"/>
             </w:pPr>
             <w:r>
-              <w:t>Deprecated functions report</w:t>
+              <w:t>Identified d</w:t>
+            </w:r>
+            <w:r>
+              <w:t>eprecated functions report</w:t>
             </w:r>
           </w:p>
         </w:tc>
@@ -589,7 +759,6 @@
         <w:tc>
           <w:tcPr>
             <w:tcW w:w="1520" w:type="dxa"/>
-            <w:shd w:val="clear" w:color="auto" w:fill="auto"/>
             <w:tcMar>
               <w:top w:w="100" w:type="dxa"/>
               <w:left w:w="100" w:type="dxa"/>
@@ -626,8 +795,7 @@
         </w:tc>
         <w:tc>
           <w:tcPr>
-            <w:tcW w:w="3420" w:type="dxa"/>
-            <w:shd w:val="clear" w:color="auto" w:fill="auto"/>
+            <w:tcW w:w="3960" w:type="dxa"/>
             <w:tcMar>
               <w:top w:w="100" w:type="dxa"/>
               <w:left w:w="100" w:type="dxa"/>
@@ -664,9 +832,9 @@
           <w:noProof/>
         </w:rPr>
         <w:drawing>
-          <wp:inline distT="0" distB="0" distL="0" distR="0" wp14:anchorId="252F2BFA" wp14:editId="2A9A4EE8">
-            <wp:extent cx="4101767" cy="4387272"/>
-            <wp:effectExtent l="0" t="0" r="635" b="0"/>
+          <wp:inline distT="0" distB="0" distL="0" distR="0" wp14:anchorId="252F2BFA" wp14:editId="0C687797">
+            <wp:extent cx="3725794" cy="4418965"/>
+            <wp:effectExtent l="0" t="0" r="0" b="635"/>
             <wp:docPr id="2" name="Picture 2"/>
             <wp:cNvGraphicFramePr>
               <a:graphicFrameLocks xmlns:a="http://schemas.openxmlformats.org/drawingml/2006/main" noChangeAspect="1"/>
@@ -679,7 +847,7 @@
                     <pic:cNvPicPr/>
                   </pic:nvPicPr>
                   <pic:blipFill>
-                    <a:blip r:embed="rId9">
+                    <a:blip r:embed="rId9" cstate="print">
                       <a:extLst>
                         <a:ext uri="{28A0092B-C50C-407E-A947-70E740481C1C}">
                           <a14:useLocalDpi xmlns:a14="http://schemas.microsoft.com/office/drawing/2010/main" val="0"/>
@@ -693,7 +861,7 @@
                   <pic:spPr>
                     <a:xfrm>
                       <a:off x="0" y="0"/>
-                      <a:ext cx="4123198" cy="4410194"/>
+                      <a:ext cx="3726758" cy="4420108"/>
                     </a:xfrm>
                     <a:prstGeom prst="rect">
                       <a:avLst/>
@@ -717,7 +885,17 @@
       <w:bookmarkEnd w:id="6"/>
       <w:bookmarkEnd w:id="7"/>
       <w:r>
-        <w:t xml:space="preserve">The Security SME reviews the </w:t>
+        <w:t xml:space="preserve">The </w:t>
+      </w:r>
+      <w:r>
+        <w:rPr>
+          <w:b/>
+          <w:bCs/>
+        </w:rPr>
+        <w:t>Security SME</w:t>
+      </w:r>
+      <w:r>
+        <w:t xml:space="preserve"> reviews the </w:t>
       </w:r>
       <w:r>
         <w:rPr>
@@ -727,14 +905,72 @@
         <w:t>Authoritative Source</w:t>
       </w:r>
       <w:r>
-        <w:t xml:space="preserve"> to identify deprecated functions. A </w:t>
-      </w:r>
-      <w:r>
-        <w:rPr>
-          <w:b/>
-          <w:bCs/>
-        </w:rPr>
-        <w:t>Deprecated Functions Report</w:t>
+        <w:rPr>
+          <w:b/>
+          <w:bCs/>
+        </w:rPr>
+        <w:t>s</w:t>
+      </w:r>
+      <w:r>
+        <w:t xml:space="preserve"> to identify functions</w:t>
+      </w:r>
+      <w:r>
+        <w:t xml:space="preserve"> which have been deprecated</w:t>
+      </w:r>
+      <w:r>
+        <w:t>.</w:t>
+      </w:r>
+      <w:r>
+        <w:t xml:space="preserve"> These are entered into</w:t>
+      </w:r>
+      <w:r>
+        <w:t xml:space="preserve"> </w:t>
+      </w:r>
+      <w:r>
+        <w:t xml:space="preserve">a </w:t>
+      </w:r>
+      <w:r>
+        <w:rPr>
+          <w:b/>
+          <w:bCs/>
+        </w:rPr>
+        <w:t>Deprecated Functions</w:t>
+      </w:r>
+      <w:r>
+        <w:t xml:space="preserve"> list</w:t>
+      </w:r>
+      <w:r>
+        <w:t xml:space="preserve">. </w:t>
+      </w:r>
+      <w:r>
+        <w:t>A</w:t>
+      </w:r>
+      <w:r>
+        <w:t>n</w:t>
+      </w:r>
+      <w:r>
+        <w:t xml:space="preserve"> </w:t>
+      </w:r>
+      <w:r>
+        <w:rPr>
+          <w:b/>
+          <w:bCs/>
+        </w:rPr>
+        <w:t xml:space="preserve">Identified </w:t>
+      </w:r>
+      <w:r>
+        <w:rPr>
+          <w:b/>
+          <w:bCs/>
+        </w:rPr>
+        <w:t>D</w:t>
+      </w:r>
+      <w:r>
+        <w:rPr>
+          <w:b/>
+          <w:bCs/>
+        </w:rPr>
+        <w:t>eprecated Functions Report</w:t>
       </w:r>
       <w:r>
         <w:t xml:space="preserve"> is generated.</w:t>
@@ -742,21 +978,13 @@
     </w:p>
     <w:p>
       <w:pPr>
-        <w:spacing w:after="240"/>
-        <w:jc w:val="both"/>
-      </w:pPr>
-      <w:r>
-        <w:t xml:space="preserve">All identified deprecated functions are entered into the </w:t>
-      </w:r>
-      <w:r>
-        <w:rPr>
-          <w:b/>
-          <w:bCs/>
-        </w:rPr>
-        <w:t>Deprecated Functions Database</w:t>
-      </w:r>
-      <w:r>
-        <w:t>.</w:t>
+        <w:rPr>
+          <w:sz w:val="32"/>
+          <w:szCs w:val="32"/>
+        </w:rPr>
+      </w:pPr>
+      <w:r>
+        <w:br w:type="page"/>
       </w:r>
     </w:p>
     <w:p>
@@ -765,12 +993,12 @@
       </w:pPr>
       <w:r>
         <w:lastRenderedPageBreak/>
-        <w:t>Scan for Deprecated Functions</w:t>
+        <w:t>Incorporate Scan</w:t>
       </w:r>
     </w:p>
     <w:tbl>
       <w:tblPr>
-        <w:tblW w:w="6740" w:type="dxa"/>
+        <w:tblW w:w="3860" w:type="dxa"/>
         <w:tblBorders>
           <w:top w:val="single" w:sz="8" w:space="0" w:color="000000"/>
           <w:left w:val="single" w:sz="8" w:space="0" w:color="000000"/>
@@ -784,13 +1012,12 @@
       </w:tblPr>
       <w:tblGrid>
         <w:gridCol w:w="1520"/>
-        <w:gridCol w:w="5220"/>
+        <w:gridCol w:w="2340"/>
       </w:tblGrid>
       <w:tr>
         <w:tc>
           <w:tcPr>
             <w:tcW w:w="1520" w:type="dxa"/>
-            <w:shd w:val="clear" w:color="auto" w:fill="auto"/>
             <w:tcMar>
               <w:top w:w="100" w:type="dxa"/>
               <w:left w:w="100" w:type="dxa"/>
@@ -827,8 +1054,7 @@
         </w:tc>
         <w:tc>
           <w:tcPr>
-            <w:tcW w:w="5220" w:type="dxa"/>
-            <w:shd w:val="clear" w:color="auto" w:fill="auto"/>
+            <w:tcW w:w="2340" w:type="dxa"/>
             <w:tcMar>
               <w:top w:w="100" w:type="dxa"/>
               <w:left w:w="100" w:type="dxa"/>
@@ -836,6 +1062,22 @@
               <w:right w:w="100" w:type="dxa"/>
             </w:tcMar>
           </w:tcPr>
+          <w:p>
+            <w:pPr>
+              <w:widowControl w:val="0"/>
+              <w:pBdr>
+                <w:top w:val="nil"/>
+                <w:left w:val="nil"/>
+                <w:bottom w:val="nil"/>
+                <w:right w:val="nil"/>
+                <w:between w:val="nil"/>
+              </w:pBdr>
+              <w:spacing w:line="240" w:lineRule="auto"/>
+            </w:pPr>
+            <w:r>
+              <w:t>Build file</w:t>
+            </w:r>
+          </w:p>
           <w:p>
             <w:pPr>
               <w:widowControl w:val="0"/>
@@ -865,7 +1107,7 @@
               <w:spacing w:line="240" w:lineRule="auto"/>
             </w:pPr>
             <w:r>
-              <w:t>Deprecated functions database</w:t>
+              <w:t xml:space="preserve">Deprecated functions </w:t>
             </w:r>
           </w:p>
         </w:tc>
@@ -874,7 +1116,6 @@
         <w:tc>
           <w:tcPr>
             <w:tcW w:w="1520" w:type="dxa"/>
-            <w:shd w:val="clear" w:color="auto" w:fill="auto"/>
             <w:tcMar>
               <w:top w:w="100" w:type="dxa"/>
               <w:left w:w="100" w:type="dxa"/>
@@ -911,8 +1152,7 @@
         </w:tc>
         <w:tc>
           <w:tcPr>
-            <w:tcW w:w="5220" w:type="dxa"/>
-            <w:shd w:val="clear" w:color="auto" w:fill="auto"/>
+            <w:tcW w:w="2340" w:type="dxa"/>
             <w:tcMar>
               <w:top w:w="100" w:type="dxa"/>
               <w:left w:w="100" w:type="dxa"/>
@@ -933,23 +1173,7 @@
               <w:spacing w:line="240" w:lineRule="auto"/>
             </w:pPr>
             <w:r>
-              <w:t>Currently used deprecated functions database</w:t>
-            </w:r>
-          </w:p>
-          <w:p>
-            <w:pPr>
-              <w:widowControl w:val="0"/>
-              <w:pBdr>
-                <w:top w:val="nil"/>
-                <w:left w:val="nil"/>
-                <w:bottom w:val="nil"/>
-                <w:right w:val="nil"/>
-                <w:between w:val="nil"/>
-              </w:pBdr>
-              <w:spacing w:line="240" w:lineRule="auto"/>
-            </w:pPr>
-            <w:r>
-              <w:t>Element currently used deprecated functions report</w:t>
+              <w:t>Updated build file</w:t>
             </w:r>
           </w:p>
         </w:tc>
@@ -958,7 +1182,6 @@
         <w:tc>
           <w:tcPr>
             <w:tcW w:w="1520" w:type="dxa"/>
-            <w:shd w:val="clear" w:color="auto" w:fill="auto"/>
             <w:tcMar>
               <w:top w:w="100" w:type="dxa"/>
               <w:left w:w="100" w:type="dxa"/>
@@ -995,8 +1218,7 @@
         </w:tc>
         <w:tc>
           <w:tcPr>
-            <w:tcW w:w="5220" w:type="dxa"/>
-            <w:shd w:val="clear" w:color="auto" w:fill="auto"/>
+            <w:tcW w:w="2340" w:type="dxa"/>
             <w:tcMar>
               <w:top w:w="100" w:type="dxa"/>
               <w:left w:w="100" w:type="dxa"/>
@@ -1015,17 +1237,9 @@
                 <w:between w:val="nil"/>
               </w:pBdr>
               <w:spacing w:line="240" w:lineRule="auto"/>
-              <w:rPr>
-                <w:b/>
-                <w:bCs/>
-              </w:rPr>
             </w:pPr>
             <w:r>
-              <w:rPr>
-                <w:b/>
-                <w:bCs/>
-              </w:rPr>
-              <w:t>none</w:t>
+              <w:t>DevOps SME</w:t>
             </w:r>
           </w:p>
         </w:tc>
@@ -1041,9 +1255,9 @@
           <w:noProof/>
         </w:rPr>
         <w:drawing>
-          <wp:inline distT="0" distB="0" distL="0" distR="0" wp14:anchorId="0B7A1613" wp14:editId="1D0DBFC5">
-            <wp:extent cx="5053454" cy="4387273"/>
-            <wp:effectExtent l="0" t="0" r="1270" b="0"/>
+          <wp:inline distT="0" distB="0" distL="0" distR="0" wp14:anchorId="0B7A1613" wp14:editId="082B9E67">
+            <wp:extent cx="4491732" cy="4396897"/>
+            <wp:effectExtent l="0" t="0" r="4445" b="0"/>
             <wp:docPr id="4" name="Picture 4"/>
             <wp:cNvGraphicFramePr>
               <a:graphicFrameLocks xmlns:a="http://schemas.openxmlformats.org/drawingml/2006/main" noChangeAspect="1"/>
@@ -1056,7 +1270,7 @@
                     <pic:cNvPicPr/>
                   </pic:nvPicPr>
                   <pic:blipFill>
-                    <a:blip r:embed="rId10">
+                    <a:blip r:embed="rId10" cstate="print">
                       <a:extLst>
                         <a:ext uri="{28A0092B-C50C-407E-A947-70E740481C1C}">
                           <a14:useLocalDpi xmlns:a14="http://schemas.microsoft.com/office/drawing/2010/main" val="0"/>
@@ -1070,7 +1284,7 @@
                   <pic:spPr>
                     <a:xfrm>
                       <a:off x="0" y="0"/>
-                      <a:ext cx="5072911" cy="4404165"/>
+                      <a:ext cx="4491732" cy="4396897"/>
                     </a:xfrm>
                     <a:prstGeom prst="rect">
                       <a:avLst/>
@@ -1090,14 +1304,43 @@
         <w:jc w:val="both"/>
       </w:pPr>
       <w:r>
-        <w:t xml:space="preserve">With the </w:t>
-      </w:r>
-      <w:r>
-        <w:rPr>
-          <w:b/>
-          <w:bCs/>
-        </w:rPr>
-        <w:t>Deprecated Functions Database</w:t>
+        <w:t>Using t</w:t>
+      </w:r>
+      <w:r>
+        <w:t xml:space="preserve">he </w:t>
+      </w:r>
+      <w:r>
+        <w:rPr>
+          <w:b/>
+          <w:bCs/>
+        </w:rPr>
+        <w:t>Deprecated Functions</w:t>
+      </w:r>
+      <w:r>
+        <w:t xml:space="preserve"> </w:t>
+      </w:r>
+      <w:r>
+        <w:t xml:space="preserve">list applicable to the </w:t>
+      </w:r>
+      <w:r>
+        <w:rPr>
+          <w:b/>
+          <w:bCs/>
+        </w:rPr>
+        <w:t>Element</w:t>
+      </w:r>
+      <w:r>
+        <w:t xml:space="preserve">, </w:t>
+      </w:r>
+      <w:r>
+        <w:t xml:space="preserve">and </w:t>
+      </w:r>
+      <w:r>
+        <w:rPr>
+          <w:b/>
+          <w:bCs/>
+        </w:rPr>
+        <w:t>Build File</w:t>
       </w:r>
       <w:r>
         <w:t xml:space="preserve">, the </w:t>
@@ -1107,48 +1350,36 @@
           <w:b/>
           <w:bCs/>
         </w:rPr>
-        <w:t>Element</w:t>
-      </w:r>
-      <w:r>
-        <w:t xml:space="preserve"> is scanned for deprecated functions </w:t>
-      </w:r>
-      <w:r>
-        <w:t xml:space="preserve">currently </w:t>
-      </w:r>
-      <w:r>
-        <w:t xml:space="preserve">in use. </w:t>
-      </w:r>
-      <w:r>
-        <w:t>The</w:t>
+        <w:t>DevOps SME</w:t>
       </w:r>
       <w:r>
         <w:t xml:space="preserve"> </w:t>
       </w:r>
       <w:r>
-        <w:rPr>
-          <w:b/>
-          <w:bCs/>
-        </w:rPr>
-        <w:t>Currently Used Deprecated Functions Database</w:t>
+        <w:t xml:space="preserve">adds a function name scanner to the appropriate section of the </w:t>
+      </w:r>
+      <w:r>
+        <w:rPr>
+          <w:b/>
+          <w:bCs/>
+        </w:rPr>
+        <w:t>Build File</w:t>
+      </w:r>
+      <w:r>
+        <w:t xml:space="preserve">. An </w:t>
+      </w:r>
+      <w:r>
+        <w:rPr>
+          <w:b/>
+          <w:bCs/>
+        </w:rPr>
+        <w:t>Updated Build File</w:t>
       </w:r>
       <w:r>
         <w:t xml:space="preserve"> is </w:t>
       </w:r>
       <w:r>
-        <w:t>updated,</w:t>
-      </w:r>
-      <w:r>
-        <w:t xml:space="preserve"> and a </w:t>
-      </w:r>
-      <w:r>
-        <w:rPr>
-          <w:b/>
-          <w:bCs/>
-        </w:rPr>
-        <w:t>Currently Used Deprecated Functions Report</w:t>
-      </w:r>
-      <w:r>
-        <w:t xml:space="preserve"> is generated</w:t>
+        <w:t>created</w:t>
       </w:r>
       <w:r>
         <w:t>.</w:t>
@@ -1171,12 +1402,12 @@
       </w:pPr>
       <w:r>
         <w:lastRenderedPageBreak/>
-        <w:t>Enumerate Deprecated Functions</w:t>
+        <w:t>Perform Scan</w:t>
       </w:r>
     </w:p>
     <w:tbl>
       <w:tblPr>
-        <w:tblW w:w="7100" w:type="dxa"/>
+        <w:tblW w:w="3500" w:type="dxa"/>
         <w:tblBorders>
           <w:top w:val="single" w:sz="8" w:space="0" w:color="000000"/>
           <w:left w:val="single" w:sz="8" w:space="0" w:color="000000"/>
@@ -1190,13 +1421,12 @@
       </w:tblPr>
       <w:tblGrid>
         <w:gridCol w:w="1520"/>
-        <w:gridCol w:w="5580"/>
+        <w:gridCol w:w="1980"/>
       </w:tblGrid>
       <w:tr>
         <w:tc>
           <w:tcPr>
             <w:tcW w:w="1520" w:type="dxa"/>
-            <w:shd w:val="clear" w:color="auto" w:fill="auto"/>
             <w:tcMar>
               <w:top w:w="100" w:type="dxa"/>
               <w:left w:w="100" w:type="dxa"/>
@@ -1233,8 +1463,7 @@
         </w:tc>
         <w:tc>
           <w:tcPr>
-            <w:tcW w:w="5580" w:type="dxa"/>
-            <w:shd w:val="clear" w:color="auto" w:fill="auto"/>
+            <w:tcW w:w="1980" w:type="dxa"/>
             <w:tcMar>
               <w:top w:w="100" w:type="dxa"/>
               <w:left w:w="100" w:type="dxa"/>
@@ -1255,7 +1484,7 @@
               <w:spacing w:line="240" w:lineRule="auto"/>
             </w:pPr>
             <w:r>
-              <w:t>Currently used deprecated functions database</w:t>
+              <w:t>Updated build file</w:t>
             </w:r>
           </w:p>
         </w:tc>
@@ -1264,7 +1493,6 @@
         <w:tc>
           <w:tcPr>
             <w:tcW w:w="1520" w:type="dxa"/>
-            <w:shd w:val="clear" w:color="auto" w:fill="auto"/>
             <w:tcMar>
               <w:top w:w="100" w:type="dxa"/>
               <w:left w:w="100" w:type="dxa"/>
@@ -1301,8 +1529,7 @@
         </w:tc>
         <w:tc>
           <w:tcPr>
-            <w:tcW w:w="5580" w:type="dxa"/>
-            <w:shd w:val="clear" w:color="auto" w:fill="auto"/>
+            <w:tcW w:w="1980" w:type="dxa"/>
             <w:tcMar>
               <w:top w:w="100" w:type="dxa"/>
               <w:left w:w="100" w:type="dxa"/>
@@ -1323,23 +1550,7 @@
               <w:spacing w:line="240" w:lineRule="auto"/>
             </w:pPr>
             <w:r>
-              <w:t>Currently used deprecated functions</w:t>
-            </w:r>
-          </w:p>
-          <w:p>
-            <w:pPr>
-              <w:widowControl w:val="0"/>
-              <w:pBdr>
-                <w:top w:val="nil"/>
-                <w:left w:val="nil"/>
-                <w:bottom w:val="nil"/>
-                <w:right w:val="nil"/>
-                <w:between w:val="nil"/>
-              </w:pBdr>
-              <w:spacing w:line="240" w:lineRule="auto"/>
-            </w:pPr>
-            <w:r>
-              <w:t>Currently used deprecated functions summary report</w:t>
+              <w:t>Scan output</w:t>
             </w:r>
           </w:p>
         </w:tc>
@@ -1348,7 +1559,6 @@
         <w:tc>
           <w:tcPr>
             <w:tcW w:w="1520" w:type="dxa"/>
-            <w:shd w:val="clear" w:color="auto" w:fill="auto"/>
             <w:tcMar>
               <w:top w:w="100" w:type="dxa"/>
               <w:left w:w="100" w:type="dxa"/>
@@ -1385,8 +1595,7 @@
         </w:tc>
         <w:tc>
           <w:tcPr>
-            <w:tcW w:w="5580" w:type="dxa"/>
-            <w:shd w:val="clear" w:color="auto" w:fill="auto"/>
+            <w:tcW w:w="1980" w:type="dxa"/>
             <w:tcMar>
               <w:top w:w="100" w:type="dxa"/>
               <w:left w:w="100" w:type="dxa"/>
@@ -1431,9 +1640,9 @@
           <w:noProof/>
         </w:rPr>
         <w:drawing>
-          <wp:inline distT="0" distB="0" distL="0" distR="0" wp14:anchorId="4D1E42DC" wp14:editId="2B859101">
-            <wp:extent cx="3723197" cy="4389755"/>
-            <wp:effectExtent l="0" t="0" r="0" b="4445"/>
+          <wp:inline distT="0" distB="0" distL="0" distR="0" wp14:anchorId="4D1E42DC" wp14:editId="19C83421">
+            <wp:extent cx="4399541" cy="4390931"/>
+            <wp:effectExtent l="0" t="0" r="0" b="3810"/>
             <wp:docPr id="5" name="Picture 5"/>
             <wp:cNvGraphicFramePr>
               <a:graphicFrameLocks xmlns:a="http://schemas.openxmlformats.org/drawingml/2006/main" noChangeAspect="1"/>
@@ -1446,7 +1655,7 @@
                     <pic:cNvPicPr/>
                   </pic:nvPicPr>
                   <pic:blipFill>
-                    <a:blip r:embed="rId11">
+                    <a:blip r:embed="rId11" cstate="print">
                       <a:extLst>
                         <a:ext uri="{28A0092B-C50C-407E-A947-70E740481C1C}">
                           <a14:useLocalDpi xmlns:a14="http://schemas.microsoft.com/office/drawing/2010/main" val="0"/>
@@ -1460,7 +1669,7 @@
                   <pic:spPr>
                     <a:xfrm>
                       <a:off x="0" y="0"/>
-                      <a:ext cx="3726614" cy="4393784"/>
+                      <a:ext cx="4447625" cy="4438921"/>
                     </a:xfrm>
                     <a:prstGeom prst="rect">
                       <a:avLst/>
@@ -1480,38 +1689,613 @@
         <w:jc w:val="both"/>
       </w:pPr>
       <w:r>
-        <w:t>Using information from</w:t>
-      </w:r>
-      <w:r>
-        <w:t xml:space="preserve"> the </w:t>
-      </w:r>
-      <w:r>
-        <w:rPr>
-          <w:b/>
-          <w:bCs/>
-        </w:rPr>
-        <w:t>Currently Used Deprecated Functions Database</w:t>
-      </w:r>
-      <w:r>
-        <w:t xml:space="preserve">, the database </w:t>
-      </w:r>
-      <w:r>
-        <w:t xml:space="preserve">iterates over </w:t>
-      </w:r>
-      <w:r>
-        <w:t xml:space="preserve">the deprecated functions and categorizes them by </w:t>
-      </w:r>
-      <w:r>
-        <w:t xml:space="preserve">programming </w:t>
-      </w:r>
-      <w:r>
-        <w:t>language. A machine</w:t>
-      </w:r>
-      <w:r>
-        <w:t>-</w:t>
-      </w:r>
-      <w:r>
-        <w:t xml:space="preserve">readable </w:t>
+        <w:t xml:space="preserve">Using </w:t>
+      </w:r>
+      <w:r>
+        <w:t xml:space="preserve">the </w:t>
+      </w:r>
+      <w:r>
+        <w:rPr>
+          <w:b/>
+          <w:bCs/>
+        </w:rPr>
+        <w:t>Updated Build File</w:t>
+      </w:r>
+      <w:r>
+        <w:t xml:space="preserve">, the </w:t>
+      </w:r>
+      <w:r>
+        <w:rPr>
+          <w:b/>
+          <w:bCs/>
+        </w:rPr>
+        <w:t>Element</w:t>
+      </w:r>
+      <w:r>
+        <w:t xml:space="preserve"> is scanned for deprecated functions.</w:t>
+      </w:r>
+      <w:r>
+        <w:t xml:space="preserve"> A </w:t>
+      </w:r>
+      <w:r>
+        <w:rPr>
+          <w:b/>
+          <w:bCs/>
+        </w:rPr>
+        <w:t>Scan Output</w:t>
+      </w:r>
+      <w:r>
+        <w:t xml:space="preserve"> list is generated.</w:t>
+      </w:r>
+    </w:p>
+    <w:p>
+      <w:pPr>
+        <w:spacing w:after="240"/>
+        <w:ind w:left="720" w:hanging="720"/>
+        <w:jc w:val="both"/>
+      </w:pPr>
+      <w:r>
+        <w:rPr>
+          <w:b/>
+          <w:bCs/>
+          <w:color w:val="0070C0"/>
+        </w:rPr>
+        <w:t>Note:</w:t>
+      </w:r>
+      <w:r>
+        <w:tab/>
+        <w:t>This activity may be performed manually.</w:t>
+      </w:r>
+    </w:p>
+    <w:p>
+      <w:pPr>
+        <w:pStyle w:val="Note"/>
+      </w:pPr>
+      <w:r>
+        <w:rPr>
+          <w:b/>
+          <w:bCs/>
+          <w:color w:val="0070C0"/>
+        </w:rPr>
+        <w:t>Note:</w:t>
+      </w:r>
+      <w:r>
+        <w:tab/>
+      </w:r>
+      <w:r>
+        <w:t xml:space="preserve">The recommended form of the </w:t>
+      </w:r>
+      <w:r>
+        <w:rPr>
+          <w:b/>
+          <w:bCs/>
+        </w:rPr>
+        <w:t>Scan Output</w:t>
+      </w:r>
+      <w:r>
+        <w:t xml:space="preserve"> artifact is JSON-encoded Static Analysis Results Interchange Format (</w:t>
+      </w:r>
+      <w:r>
+        <w:rPr>
+          <w:b/>
+          <w:bCs/>
+        </w:rPr>
+        <w:t>SARIF</w:t>
+      </w:r>
+      <w:r>
+        <w:t xml:space="preserve">). This document assumes SARIF version 2.1.0 </w:t>
+      </w:r>
+      <w:r>
+        <w:rPr>
+          <w:b/>
+          <w:bCs/>
+          <w:color w:val="0070C0"/>
+          <w:vertAlign w:val="superscript"/>
+        </w:rPr>
+        <w:t>[</w:t>
+      </w:r>
+      <w:r>
+        <w:rPr>
+          <w:b/>
+          <w:bCs/>
+          <w:color w:val="0070C0"/>
+          <w:vertAlign w:val="superscript"/>
+        </w:rPr>
+        <w:t>2</w:t>
+      </w:r>
+      <w:r>
+        <w:rPr>
+          <w:b/>
+          <w:bCs/>
+          <w:color w:val="0070C0"/>
+          <w:vertAlign w:val="superscript"/>
+        </w:rPr>
+        <w:t>]</w:t>
+      </w:r>
+      <w:r>
+        <w:t xml:space="preserve"> or later</w:t>
+      </w:r>
+      <w:r>
+        <w:t>.</w:t>
+      </w:r>
+    </w:p>
+    <w:p>
+      <w:pPr>
+        <w:spacing w:after="240"/>
+        <w:jc w:val="both"/>
+      </w:pPr>
+    </w:p>
+    <w:p>
+      <w:pPr>
+        <w:rPr>
+          <w:sz w:val="32"/>
+          <w:szCs w:val="32"/>
+        </w:rPr>
+      </w:pPr>
+      <w:r>
+        <w:br w:type="page"/>
+      </w:r>
+    </w:p>
+    <w:p>
+      <w:pPr>
+        <w:pStyle w:val="Heading2"/>
+      </w:pPr>
+      <w:r>
+        <w:lastRenderedPageBreak/>
+        <w:t>Triage</w:t>
+      </w:r>
+    </w:p>
+    <w:tbl>
+      <w:tblPr>
+        <w:tblW w:w="6020" w:type="dxa"/>
+        <w:tblBorders>
+          <w:top w:val="single" w:sz="8" w:space="0" w:color="000000"/>
+          <w:left w:val="single" w:sz="8" w:space="0" w:color="000000"/>
+          <w:bottom w:val="single" w:sz="8" w:space="0" w:color="000000"/>
+          <w:right w:val="single" w:sz="8" w:space="0" w:color="000000"/>
+          <w:insideH w:val="single" w:sz="8" w:space="0" w:color="000000"/>
+          <w:insideV w:val="single" w:sz="8" w:space="0" w:color="000000"/>
+        </w:tblBorders>
+        <w:tblLayout w:type="fixed"/>
+        <w:tblLook w:val="0600" w:firstRow="0" w:lastRow="0" w:firstColumn="0" w:lastColumn="0" w:noHBand="1" w:noVBand="1"/>
+      </w:tblPr>
+      <w:tblGrid>
+        <w:gridCol w:w="1520"/>
+        <w:gridCol w:w="4500"/>
+      </w:tblGrid>
+      <w:tr>
+        <w:tc>
+          <w:tcPr>
+            <w:tcW w:w="1520" w:type="dxa"/>
+            <w:tcMar>
+              <w:top w:w="100" w:type="dxa"/>
+              <w:left w:w="100" w:type="dxa"/>
+              <w:bottom w:w="100" w:type="dxa"/>
+              <w:right w:w="100" w:type="dxa"/>
+            </w:tcMar>
+            <w:vAlign w:val="center"/>
+          </w:tcPr>
+          <w:p>
+            <w:pPr>
+              <w:widowControl w:val="0"/>
+              <w:pBdr>
+                <w:top w:val="nil"/>
+                <w:left w:val="nil"/>
+                <w:bottom w:val="nil"/>
+                <w:right w:val="nil"/>
+                <w:between w:val="nil"/>
+              </w:pBdr>
+              <w:spacing w:line="240" w:lineRule="auto"/>
+              <w:jc w:val="right"/>
+              <w:rPr>
+                <w:b/>
+                <w:bCs/>
+              </w:rPr>
+            </w:pPr>
+            <w:r>
+              <w:rPr>
+                <w:b/>
+                <w:bCs/>
+              </w:rPr>
+              <w:t>Inputs</w:t>
+            </w:r>
+          </w:p>
+        </w:tc>
+        <w:tc>
+          <w:tcPr>
+            <w:tcW w:w="4500" w:type="dxa"/>
+            <w:tcMar>
+              <w:top w:w="100" w:type="dxa"/>
+              <w:left w:w="100" w:type="dxa"/>
+              <w:bottom w:w="100" w:type="dxa"/>
+              <w:right w:w="100" w:type="dxa"/>
+            </w:tcMar>
+          </w:tcPr>
+          <w:p>
+            <w:pPr>
+              <w:widowControl w:val="0"/>
+              <w:pBdr>
+                <w:top w:val="nil"/>
+                <w:left w:val="nil"/>
+                <w:bottom w:val="nil"/>
+                <w:right w:val="nil"/>
+                <w:between w:val="nil"/>
+              </w:pBdr>
+              <w:spacing w:line="240" w:lineRule="auto"/>
+            </w:pPr>
+            <w:r>
+              <w:t>Scan output</w:t>
+            </w:r>
+          </w:p>
+        </w:tc>
+      </w:tr>
+      <w:tr>
+        <w:tc>
+          <w:tcPr>
+            <w:tcW w:w="1520" w:type="dxa"/>
+            <w:tcMar>
+              <w:top w:w="100" w:type="dxa"/>
+              <w:left w:w="100" w:type="dxa"/>
+              <w:bottom w:w="100" w:type="dxa"/>
+              <w:right w:w="100" w:type="dxa"/>
+            </w:tcMar>
+            <w:vAlign w:val="center"/>
+          </w:tcPr>
+          <w:p>
+            <w:pPr>
+              <w:widowControl w:val="0"/>
+              <w:pBdr>
+                <w:top w:val="nil"/>
+                <w:left w:val="nil"/>
+                <w:bottom w:val="nil"/>
+                <w:right w:val="nil"/>
+                <w:between w:val="nil"/>
+              </w:pBdr>
+              <w:spacing w:line="240" w:lineRule="auto"/>
+              <w:jc w:val="right"/>
+              <w:rPr>
+                <w:b/>
+                <w:bCs/>
+              </w:rPr>
+            </w:pPr>
+            <w:r>
+              <w:rPr>
+                <w:b/>
+                <w:bCs/>
+              </w:rPr>
+              <w:t>Outputs</w:t>
+            </w:r>
+          </w:p>
+        </w:tc>
+        <w:tc>
+          <w:tcPr>
+            <w:tcW w:w="4500" w:type="dxa"/>
+            <w:tcMar>
+              <w:top w:w="100" w:type="dxa"/>
+              <w:left w:w="100" w:type="dxa"/>
+              <w:bottom w:w="100" w:type="dxa"/>
+              <w:right w:w="100" w:type="dxa"/>
+            </w:tcMar>
+          </w:tcPr>
+          <w:p>
+            <w:pPr>
+              <w:widowControl w:val="0"/>
+              <w:pBdr>
+                <w:top w:val="nil"/>
+                <w:left w:val="nil"/>
+                <w:bottom w:val="nil"/>
+                <w:right w:val="nil"/>
+                <w:between w:val="nil"/>
+              </w:pBdr>
+              <w:spacing w:line="240" w:lineRule="auto"/>
+            </w:pPr>
+            <w:r>
+              <w:t>Identified issues</w:t>
+            </w:r>
+          </w:p>
+          <w:p>
+            <w:pPr>
+              <w:widowControl w:val="0"/>
+              <w:pBdr>
+                <w:top w:val="nil"/>
+                <w:left w:val="nil"/>
+                <w:bottom w:val="nil"/>
+                <w:right w:val="nil"/>
+                <w:between w:val="nil"/>
+              </w:pBdr>
+              <w:spacing w:line="240" w:lineRule="auto"/>
+            </w:pPr>
+            <w:r>
+              <w:t>Currently used deprecated functions report</w:t>
+            </w:r>
+          </w:p>
+        </w:tc>
+      </w:tr>
+      <w:tr>
+        <w:tc>
+          <w:tcPr>
+            <w:tcW w:w="1520" w:type="dxa"/>
+            <w:tcMar>
+              <w:top w:w="100" w:type="dxa"/>
+              <w:left w:w="100" w:type="dxa"/>
+              <w:bottom w:w="100" w:type="dxa"/>
+              <w:right w:w="100" w:type="dxa"/>
+            </w:tcMar>
+            <w:vAlign w:val="center"/>
+          </w:tcPr>
+          <w:p>
+            <w:pPr>
+              <w:widowControl w:val="0"/>
+              <w:pBdr>
+                <w:top w:val="nil"/>
+                <w:left w:val="nil"/>
+                <w:bottom w:val="nil"/>
+                <w:right w:val="nil"/>
+                <w:between w:val="nil"/>
+              </w:pBdr>
+              <w:spacing w:line="240" w:lineRule="auto"/>
+              <w:jc w:val="right"/>
+              <w:rPr>
+                <w:b/>
+                <w:bCs/>
+              </w:rPr>
+            </w:pPr>
+            <w:r>
+              <w:rPr>
+                <w:b/>
+                <w:bCs/>
+              </w:rPr>
+              <w:t>Participants</w:t>
+            </w:r>
+          </w:p>
+        </w:tc>
+        <w:tc>
+          <w:tcPr>
+            <w:tcW w:w="4500" w:type="dxa"/>
+            <w:tcMar>
+              <w:top w:w="100" w:type="dxa"/>
+              <w:left w:w="100" w:type="dxa"/>
+              <w:bottom w:w="100" w:type="dxa"/>
+              <w:right w:w="100" w:type="dxa"/>
+            </w:tcMar>
+          </w:tcPr>
+          <w:p>
+            <w:pPr>
+              <w:widowControl w:val="0"/>
+              <w:pBdr>
+                <w:top w:val="nil"/>
+                <w:left w:val="nil"/>
+                <w:bottom w:val="nil"/>
+                <w:right w:val="nil"/>
+                <w:between w:val="nil"/>
+              </w:pBdr>
+              <w:spacing w:line="240" w:lineRule="auto"/>
+            </w:pPr>
+            <w:r>
+              <w:t>Security SME</w:t>
+            </w:r>
+          </w:p>
+          <w:p>
+            <w:pPr>
+              <w:widowControl w:val="0"/>
+              <w:pBdr>
+                <w:top w:val="nil"/>
+                <w:left w:val="nil"/>
+                <w:bottom w:val="nil"/>
+                <w:right w:val="nil"/>
+                <w:between w:val="nil"/>
+              </w:pBdr>
+              <w:spacing w:line="240" w:lineRule="auto"/>
+            </w:pPr>
+            <w:r>
+              <w:t>Development SME</w:t>
+            </w:r>
+          </w:p>
+        </w:tc>
+      </w:tr>
+    </w:tbl>
+    <w:p/>
+    <w:p>
+      <w:pPr>
+        <w:jc w:val="center"/>
+      </w:pPr>
+      <w:r>
+        <w:rPr>
+          <w:noProof/>
+        </w:rPr>
+        <w:drawing>
+          <wp:inline distT="0" distB="0" distL="0" distR="0" wp14:anchorId="122BB678" wp14:editId="02A1F1DC">
+            <wp:extent cx="4956303" cy="4419082"/>
+            <wp:effectExtent l="0" t="0" r="0" b="635"/>
+            <wp:docPr id="1610181234" name="Picture 1610181234"/>
+            <wp:cNvGraphicFramePr>
+              <a:graphicFrameLocks xmlns:a="http://schemas.openxmlformats.org/drawingml/2006/main" noChangeAspect="1"/>
+            </wp:cNvGraphicFramePr>
+            <a:graphic xmlns:a="http://schemas.openxmlformats.org/drawingml/2006/main">
+              <a:graphicData uri="http://schemas.openxmlformats.org/drawingml/2006/picture">
+                <pic:pic xmlns:pic="http://schemas.openxmlformats.org/drawingml/2006/picture">
+                  <pic:nvPicPr>
+                    <pic:cNvPr id="1610181234" name="Picture 1610181234"/>
+                    <pic:cNvPicPr/>
+                  </pic:nvPicPr>
+                  <pic:blipFill>
+                    <a:blip r:embed="rId12" cstate="print">
+                      <a:extLst>
+                        <a:ext uri="{28A0092B-C50C-407E-A947-70E740481C1C}">
+                          <a14:useLocalDpi xmlns:a14="http://schemas.microsoft.com/office/drawing/2010/main" val="0"/>
+                        </a:ext>
+                      </a:extLst>
+                    </a:blip>
+                    <a:stretch>
+                      <a:fillRect/>
+                    </a:stretch>
+                  </pic:blipFill>
+                  <pic:spPr>
+                    <a:xfrm>
+                      <a:off x="0" y="0"/>
+                      <a:ext cx="4956303" cy="4419082"/>
+                    </a:xfrm>
+                    <a:prstGeom prst="rect">
+                      <a:avLst/>
+                    </a:prstGeom>
+                  </pic:spPr>
+                </pic:pic>
+              </a:graphicData>
+            </a:graphic>
+          </wp:inline>
+        </w:drawing>
+      </w:r>
+    </w:p>
+    <w:p/>
+    <w:p>
+      <w:pPr>
+        <w:spacing w:after="240"/>
+        <w:jc w:val="both"/>
+      </w:pPr>
+      <w:r>
+        <w:t xml:space="preserve">The </w:t>
+      </w:r>
+      <w:r>
+        <w:rPr>
+          <w:b/>
+          <w:bCs/>
+        </w:rPr>
+        <w:t>Security SME</w:t>
+      </w:r>
+      <w:r>
+        <w:t xml:space="preserve"> and </w:t>
+      </w:r>
+      <w:r>
+        <w:rPr>
+          <w:b/>
+          <w:bCs/>
+        </w:rPr>
+        <w:t>Development SME</w:t>
+      </w:r>
+      <w:r>
+        <w:t xml:space="preserve"> review the </w:t>
+      </w:r>
+      <w:r>
+        <w:rPr>
+          <w:b/>
+          <w:bCs/>
+        </w:rPr>
+        <w:t>Scan</w:t>
+      </w:r>
+      <w:r>
+        <w:rPr>
+          <w:b/>
+          <w:bCs/>
+        </w:rPr>
+        <w:t xml:space="preserve"> </w:t>
+      </w:r>
+      <w:r>
+        <w:rPr>
+          <w:b/>
+          <w:bCs/>
+        </w:rPr>
+        <w:t>O</w:t>
+      </w:r>
+      <w:r>
+        <w:rPr>
+          <w:b/>
+          <w:bCs/>
+        </w:rPr>
+        <w:t>utput</w:t>
+      </w:r>
+      <w:r>
+        <w:t xml:space="preserve"> to </w:t>
+      </w:r>
+      <w:r>
+        <w:t>identify</w:t>
+      </w:r>
+      <w:r>
+        <w:t xml:space="preserve"> </w:t>
+      </w:r>
+      <w:r>
+        <w:t>deprecated function usage</w:t>
+      </w:r>
+      <w:r>
+        <w:t xml:space="preserve"> </w:t>
+      </w:r>
+      <w:r>
+        <w:t>needing</w:t>
+      </w:r>
+      <w:r>
+        <w:t xml:space="preserve"> further investigat</w:t>
+      </w:r>
+      <w:r>
+        <w:t>ion</w:t>
+      </w:r>
+      <w:r>
+        <w:t xml:space="preserve">. </w:t>
+      </w:r>
+      <w:r>
+        <w:t xml:space="preserve">These </w:t>
+      </w:r>
+      <w:r>
+        <w:rPr>
+          <w:b/>
+          <w:bCs/>
+        </w:rPr>
+        <w:t>I</w:t>
+      </w:r>
+      <w:r>
+        <w:rPr>
+          <w:b/>
+          <w:bCs/>
+        </w:rPr>
+        <w:t xml:space="preserve">dentified </w:t>
+      </w:r>
+      <w:r>
+        <w:rPr>
+          <w:b/>
+          <w:bCs/>
+        </w:rPr>
+        <w:t>I</w:t>
+      </w:r>
+      <w:r>
+        <w:rPr>
+          <w:b/>
+          <w:bCs/>
+        </w:rPr>
+        <w:t>ssues</w:t>
+      </w:r>
+      <w:r>
+        <w:t xml:space="preserve"> are sent to the threat prioritization process </w:t>
+      </w:r>
+      <w:r>
+        <w:rPr>
+          <w:b/>
+          <w:bCs/>
+          <w:color w:val="0070C0"/>
+          <w:vertAlign w:val="superscript"/>
+        </w:rPr>
+        <w:t>[</w:t>
+      </w:r>
+      <w:r>
+        <w:rPr>
+          <w:b/>
+          <w:bCs/>
+          <w:color w:val="0070C0"/>
+          <w:vertAlign w:val="superscript"/>
+        </w:rPr>
+        <w:t>3</w:t>
+      </w:r>
+      <w:r>
+        <w:rPr>
+          <w:b/>
+          <w:bCs/>
+          <w:color w:val="0070C0"/>
+          <w:vertAlign w:val="superscript"/>
+        </w:rPr>
+        <w:t>]</w:t>
+      </w:r>
+      <w:r>
+        <w:t>.</w:t>
+      </w:r>
+      <w:r>
+        <w:t xml:space="preserve"> A </w:t>
       </w:r>
       <w:r>
         <w:rPr>
@@ -1521,44 +2305,409 @@
         <w:t>Currently Used Deprecated Functions</w:t>
       </w:r>
       <w:r>
-        <w:t xml:space="preserve"> list is generated. </w:t>
-      </w:r>
-      <w:r>
-        <w:t>A</w:t>
-      </w:r>
-      <w:r>
+        <w:rPr>
+          <w:b/>
+          <w:bCs/>
+        </w:rPr>
         <w:t xml:space="preserve"> </w:t>
       </w:r>
       <w:r>
-        <w:t>human</w:t>
-      </w:r>
-      <w:r>
-        <w:t xml:space="preserve"> readable</w:t>
+        <w:rPr>
+          <w:b/>
+          <w:bCs/>
+        </w:rPr>
+        <w:t>R</w:t>
+      </w:r>
+      <w:r>
+        <w:rPr>
+          <w:b/>
+          <w:bCs/>
+        </w:rPr>
+        <w:t>eport</w:t>
       </w:r>
       <w:r>
         <w:t xml:space="preserve"> </w:t>
       </w:r>
       <w:r>
-        <w:rPr>
-          <w:b/>
-          <w:bCs/>
-        </w:rPr>
-        <w:t>Currently Used Deprecated Functions Summary Report</w:t>
-      </w:r>
-      <w:r>
-        <w:t xml:space="preserve"> is also generated</w:t>
-      </w:r>
-      <w:r>
-        <w:t xml:space="preserve"> from the </w:t>
-      </w:r>
-      <w:r>
-        <w:t>machine-readable</w:t>
-      </w:r>
-      <w:r>
-        <w:t xml:space="preserve"> list</w:t>
+        <w:t>is</w:t>
+      </w:r>
+      <w:r>
+        <w:t xml:space="preserve"> be generated.</w:t>
+      </w:r>
+    </w:p>
+    <w:p>
+      <w:pPr>
+        <w:spacing w:after="240"/>
+        <w:ind w:left="720" w:hanging="720"/>
+        <w:jc w:val="both"/>
+      </w:pPr>
+      <w:r>
+        <w:rPr>
+          <w:b/>
+          <w:bCs/>
+          <w:color w:val="0070C0"/>
+        </w:rPr>
+        <w:t>Note:</w:t>
+      </w:r>
+      <w:r>
+        <w:tab/>
+        <w:t>Depending on the nature of an identified issue, it may be entered directly into the issue tracking system.</w:t>
+      </w:r>
+    </w:p>
+    <w:p>
+      <w:pPr>
+        <w:spacing w:after="240"/>
+        <w:ind w:left="720" w:hanging="720"/>
+        <w:jc w:val="both"/>
+      </w:pPr>
+      <w:r>
+        <w:rPr>
+          <w:b/>
+          <w:bCs/>
+          <w:color w:val="0070C0"/>
+        </w:rPr>
+        <w:t>Note:</w:t>
+      </w:r>
+      <w:r>
+        <w:tab/>
+      </w:r>
+      <w:r>
+        <w:t xml:space="preserve">The </w:t>
+      </w:r>
+      <w:r>
+        <w:t xml:space="preserve">recommended form of the </w:t>
+      </w:r>
+      <w:r>
+        <w:rPr>
+          <w:b/>
+          <w:bCs/>
+        </w:rPr>
+        <w:t>Identified Issues</w:t>
+      </w:r>
+      <w:r>
+        <w:t xml:space="preserve"> artifact is </w:t>
+      </w:r>
+      <w:r>
+        <w:t xml:space="preserve">JSON-encoded </w:t>
+      </w:r>
+      <w:r>
+        <w:rPr>
+          <w:b/>
+          <w:bCs/>
+        </w:rPr>
+        <w:t>SARIF</w:t>
       </w:r>
       <w:r>
         <w:t>.</w:t>
+      </w:r>
+    </w:p>
+    <w:p>
+      <w:pPr>
+        <w:pStyle w:val="Heading3"/>
+        <w:rPr>
+          <w:color w:val="0070C0"/>
+        </w:rPr>
+      </w:pPr>
+      <w:r>
+        <w:rPr>
+          <w:color w:val="0070C0"/>
+        </w:rPr>
+        <w:lastRenderedPageBreak/>
+        <w:t>Report</w:t>
+      </w:r>
+    </w:p>
+    <w:p>
+      <w:pPr>
+        <w:spacing w:after="240"/>
+        <w:jc w:val="both"/>
+      </w:pPr>
+      <w:r>
+        <w:t xml:space="preserve">The </w:t>
+      </w:r>
+      <w:r>
+        <w:rPr>
+          <w:b/>
+          <w:bCs/>
+        </w:rPr>
+        <w:t xml:space="preserve">Currently Used Deprecated Functions </w:t>
+      </w:r>
+      <w:r>
+        <w:rPr>
+          <w:b/>
+          <w:bCs/>
+        </w:rPr>
+        <w:t>Report</w:t>
+      </w:r>
+      <w:r>
+        <w:t xml:space="preserve"> is recommended to be produced from the </w:t>
+      </w:r>
+      <w:r>
+        <w:rPr>
+          <w:b/>
+          <w:bCs/>
+        </w:rPr>
+        <w:t>I</w:t>
+      </w:r>
+      <w:r>
+        <w:rPr>
+          <w:b/>
+          <w:bCs/>
+        </w:rPr>
+        <w:t xml:space="preserve">dentified </w:t>
+      </w:r>
+      <w:r>
+        <w:rPr>
+          <w:b/>
+          <w:bCs/>
+        </w:rPr>
+        <w:t>I</w:t>
+      </w:r>
+      <w:r>
+        <w:rPr>
+          <w:b/>
+          <w:bCs/>
+        </w:rPr>
+        <w:t>ssues</w:t>
+      </w:r>
+      <w:r>
+        <w:t xml:space="preserve"> artifact and should detail the issues exposed by the static analysis.</w:t>
+      </w:r>
+    </w:p>
+    <w:p>
+      <w:pPr>
+        <w:spacing w:after="240"/>
+        <w:jc w:val="both"/>
+      </w:pPr>
+      <w:r>
+        <w:t>The report contains one or more analysis runs. Each run includes:</w:t>
+      </w:r>
+    </w:p>
+    <w:p>
+      <w:pPr>
+        <w:pStyle w:val="ListParagraph"/>
+        <w:numPr>
+          <w:ilvl w:val="0"/>
+          <w:numId w:val="3"/>
+        </w:numPr>
+        <w:ind w:left="360"/>
+      </w:pPr>
+      <w:r>
+        <w:t>Description of the analyzed element</w:t>
+      </w:r>
+    </w:p>
+    <w:p>
+      <w:pPr>
+        <w:pStyle w:val="ListParagraph"/>
+        <w:numPr>
+          <w:ilvl w:val="0"/>
+          <w:numId w:val="3"/>
+        </w:numPr>
+        <w:ind w:left="360"/>
+      </w:pPr>
+      <w:r>
+        <w:t>Deprecated functions list</w:t>
+      </w:r>
+    </w:p>
+    <w:p>
+      <w:pPr>
+        <w:pStyle w:val="ListParagraph"/>
+        <w:numPr>
+          <w:ilvl w:val="0"/>
+          <w:numId w:val="3"/>
+        </w:numPr>
+        <w:spacing w:after="240"/>
+        <w:ind w:left="360"/>
+      </w:pPr>
+      <w:r>
+        <w:t>Results of the analysis</w:t>
+      </w:r>
+    </w:p>
+    <w:p>
+      <w:pPr>
+        <w:spacing w:after="240"/>
+      </w:pPr>
+      <w:r>
+        <w:t>The analyzed element description (one or more) provides information related to the element under consideration. Each includes:</w:t>
+      </w:r>
+    </w:p>
+    <w:p>
+      <w:pPr>
+        <w:pStyle w:val="ListParagraph"/>
+        <w:numPr>
+          <w:ilvl w:val="0"/>
+          <w:numId w:val="6"/>
+        </w:numPr>
+        <w:spacing w:after="240"/>
+        <w:ind w:left="360"/>
+      </w:pPr>
+      <w:r>
+        <w:t>URI to analyzed element</w:t>
+      </w:r>
+    </w:p>
+    <w:p>
+      <w:pPr>
+        <w:pStyle w:val="ListParagraph"/>
+        <w:numPr>
+          <w:ilvl w:val="0"/>
+          <w:numId w:val="6"/>
+        </w:numPr>
+        <w:spacing w:after="240"/>
+        <w:ind w:left="360"/>
+      </w:pPr>
+      <w:r>
+        <w:t>URI to repository the element came from</w:t>
+      </w:r>
+    </w:p>
+    <w:p>
+      <w:pPr>
+        <w:spacing w:after="240"/>
+      </w:pPr>
+      <w:r>
+        <w:t xml:space="preserve">The </w:t>
+      </w:r>
+      <w:r>
+        <w:t>deprecated function</w:t>
+      </w:r>
+      <w:r>
+        <w:t>s</w:t>
+      </w:r>
+      <w:r>
+        <w:t xml:space="preserve"> (one or more) </w:t>
+      </w:r>
+      <w:r>
+        <w:t>present</w:t>
+      </w:r>
+      <w:r>
+        <w:t>. Each includes:</w:t>
+      </w:r>
+    </w:p>
+    <w:p>
+      <w:pPr>
+        <w:pStyle w:val="ListParagraph"/>
+        <w:numPr>
+          <w:ilvl w:val="0"/>
+          <w:numId w:val="5"/>
+        </w:numPr>
+        <w:spacing w:after="240"/>
+        <w:ind w:left="360"/>
+      </w:pPr>
+      <w:r>
+        <w:t>ID (unique)</w:t>
+      </w:r>
+    </w:p>
+    <w:p>
+      <w:pPr>
+        <w:pStyle w:val="ListParagraph"/>
+        <w:numPr>
+          <w:ilvl w:val="0"/>
+          <w:numId w:val="5"/>
+        </w:numPr>
+        <w:spacing w:after="240"/>
+        <w:ind w:left="360"/>
+      </w:pPr>
+      <w:r>
+        <w:t>Name</w:t>
+      </w:r>
+    </w:p>
+    <w:p>
+      <w:pPr>
+        <w:pStyle w:val="ListParagraph"/>
+        <w:numPr>
+          <w:ilvl w:val="0"/>
+          <w:numId w:val="5"/>
+        </w:numPr>
+        <w:spacing w:after="240"/>
+        <w:ind w:left="360"/>
+      </w:pPr>
+      <w:r>
+        <w:t>Short description</w:t>
+      </w:r>
+    </w:p>
+    <w:p>
+      <w:pPr>
+        <w:pStyle w:val="ListParagraph"/>
+        <w:numPr>
+          <w:ilvl w:val="0"/>
+          <w:numId w:val="5"/>
+        </w:numPr>
+        <w:spacing w:after="240"/>
+        <w:ind w:left="360"/>
+      </w:pPr>
+      <w:r>
+        <w:t xml:space="preserve">URI to </w:t>
+      </w:r>
+      <w:r>
+        <w:t>function deprecation</w:t>
+      </w:r>
+      <w:r>
+        <w:t xml:space="preserve"> documentation</w:t>
+      </w:r>
+    </w:p>
+    <w:p>
+      <w:pPr>
+        <w:pStyle w:val="ListParagraph"/>
+        <w:numPr>
+          <w:ilvl w:val="0"/>
+          <w:numId w:val="5"/>
+        </w:numPr>
+        <w:spacing w:after="240"/>
+        <w:ind w:left="360"/>
+      </w:pPr>
+      <w:r>
+        <w:t>Reference (optional) to associated taxonomy entry (Common Weakness Enumeration, …)</w:t>
+      </w:r>
+    </w:p>
+    <w:p>
+      <w:pPr>
+        <w:spacing w:after="240"/>
+      </w:pPr>
+      <w:r>
+        <w:t>The analysis results (one or more) describe the issues exposed by the analysis. Each includes:</w:t>
+      </w:r>
+    </w:p>
+    <w:p>
+      <w:pPr>
+        <w:pStyle w:val="ListParagraph"/>
+        <w:numPr>
+          <w:ilvl w:val="0"/>
+          <w:numId w:val="7"/>
+        </w:numPr>
+        <w:spacing w:after="240"/>
+        <w:ind w:left="360"/>
+      </w:pPr>
+      <w:r>
+        <w:t>Human-readable description</w:t>
+      </w:r>
+    </w:p>
+    <w:p>
+      <w:pPr>
+        <w:pStyle w:val="ListParagraph"/>
+        <w:numPr>
+          <w:ilvl w:val="0"/>
+          <w:numId w:val="7"/>
+        </w:numPr>
+        <w:spacing w:after="240"/>
+        <w:ind w:left="360"/>
+      </w:pPr>
+      <w:r>
+        <w:t>Location within the element of the issue</w:t>
+      </w:r>
+    </w:p>
+    <w:p>
+      <w:pPr>
+        <w:pStyle w:val="ListParagraph"/>
+        <w:numPr>
+          <w:ilvl w:val="0"/>
+          <w:numId w:val="7"/>
+        </w:numPr>
+        <w:spacing w:after="240"/>
+        <w:ind w:left="360"/>
+      </w:pPr>
+      <w:r>
+        <w:t>Disposition</w:t>
+      </w:r>
+      <w:r>
+        <w:t xml:space="preserve"> of the issue</w:t>
       </w:r>
     </w:p>
     <w:p>
@@ -1600,10 +2749,65 @@
           <w:b/>
           <w:bCs/>
         </w:rPr>
-        <w:t xml:space="preserve">Deprecated Functions Report </w:t>
-      </w:r>
-      <w:r>
-        <w:t>(AVCDL tertiary document)</w:t>
+        <w:t>AVCDL</w:t>
+      </w:r>
+      <w:r>
+        <w:rPr>
+          <w:b/>
+          <w:bCs/>
+        </w:rPr>
+        <w:t xml:space="preserve"> </w:t>
+      </w:r>
+      <w:r>
+        <w:t xml:space="preserve">(AVCDL </w:t>
+      </w:r>
+      <w:r>
+        <w:t>primary</w:t>
+      </w:r>
+      <w:r>
+        <w:t xml:space="preserve"> document)</w:t>
+      </w:r>
+    </w:p>
+    <w:p>
+      <w:pPr>
+        <w:pStyle w:val="ListParagraph"/>
+        <w:numPr>
+          <w:ilvl w:val="0"/>
+          <w:numId w:val="1"/>
+        </w:numPr>
+        <w:ind w:left="360"/>
+        <w:rPr>
+          <w:b/>
+          <w:bCs/>
+        </w:rPr>
+      </w:pPr>
+      <w:r>
+        <w:rPr>
+          <w:b/>
+          <w:bCs/>
+          <w:color w:val="000000" w:themeColor="text1"/>
+        </w:rPr>
+        <w:t>Static Analysis Results Interchange Format (SARIF) Version 2.1.0</w:t>
+      </w:r>
+      <w:r>
+        <w:rPr>
+          <w:color w:val="000000" w:themeColor="text1"/>
+        </w:rPr>
+        <w:br/>
+      </w:r>
+      <w:hyperlink r:id="rId13" w:history="1">
+        <w:r>
+          <w:rPr>
+            <w:rStyle w:val="Hyperlink"/>
+          </w:rPr>
+          <w:t>https://docs.oasis-open.org/sarif/sarif/v2.1.0/os/sarif-v2.1.0-os.pdf</w:t>
+        </w:r>
+      </w:hyperlink>
+      <w:r>
+        <w:rPr>
+          <w:color w:val="000000" w:themeColor="text1"/>
+        </w:rPr>
+        <w:t xml:space="preserve"> </w:t>
       </w:r>
     </w:p>
     <w:p>
@@ -1625,42 +2829,30 @@
           <w:b/>
           <w:bCs/>
         </w:rPr>
-        <w:t xml:space="preserve">Currently Used Deprecated Functions Report </w:t>
-      </w:r>
-      <w:r>
-        <w:t>(AVCDL tertiary document)</w:t>
-      </w:r>
-    </w:p>
-    <w:p>
-      <w:pPr>
-        <w:pStyle w:val="ListParagraph"/>
-        <w:numPr>
-          <w:ilvl w:val="0"/>
-          <w:numId w:val="1"/>
-        </w:numPr>
-        <w:ind w:left="360"/>
-        <w:jc w:val="both"/>
-        <w:rPr>
-          <w:b/>
-          <w:bCs/>
-        </w:rPr>
-      </w:pPr>
-      <w:r>
-        <w:rPr>
-          <w:b/>
-          <w:bCs/>
-        </w:rPr>
-        <w:t xml:space="preserve">Currently Used Deprecated Functions Summary Report </w:t>
-      </w:r>
-      <w:r>
-        <w:t>(AVCDL tertiary document)</w:t>
+        <w:t>Threat Prioritization Plan</w:t>
+      </w:r>
+      <w:r>
+        <w:rPr>
+          <w:b/>
+          <w:bCs/>
+        </w:rPr>
+        <w:t xml:space="preserve"> </w:t>
+      </w:r>
+      <w:r>
+        <w:t xml:space="preserve">(AVCDL </w:t>
+      </w:r>
+      <w:r>
+        <w:t>secondary</w:t>
+      </w:r>
+      <w:r>
+        <w:t xml:space="preserve"> document)</w:t>
       </w:r>
     </w:p>
     <w:p/>
     <w:sectPr>
-      <w:footerReference w:type="even" r:id="rId12"/>
-      <w:footerReference w:type="default" r:id="rId13"/>
-      <w:headerReference w:type="first" r:id="rId14"/>
+      <w:footerReference w:type="even" r:id="rId14"/>
+      <w:footerReference w:type="default" r:id="rId15"/>
+      <w:headerReference w:type="first" r:id="rId16"/>
       <w:pgSz w:w="12240" w:h="15840"/>
       <w:pgMar w:top="1440" w:right="1440" w:bottom="1440" w:left="1440" w:header="720" w:footer="720" w:gutter="0"/>
       <w:pgNumType w:start="1"/>
@@ -1672,7 +2864,7 @@
 </file>
 
 <file path=word/endnotes.xml><?xml version="1.0" encoding="utf-8"?>
-<w:endnotes xmlns:wpc="http://schemas.microsoft.com/office/word/2010/wordprocessingCanvas" xmlns:cx="http://schemas.microsoft.com/office/drawing/2014/chartex" xmlns:cx1="http://schemas.microsoft.com/office/drawing/2015/9/8/chartex" xmlns:cx2="http://schemas.microsoft.com/office/drawing/2015/10/21/chartex" xmlns:cx3="http://schemas.microsoft.com/office/drawing/2016/5/9/chartex" xmlns:cx4="http://schemas.microsoft.com/office/drawing/2016/5/10/chartex" xmlns:cx5="http://schemas.microsoft.com/office/drawing/2016/5/11/chartex" xmlns:cx6="http://schemas.microsoft.com/office/drawing/2016/5/12/chartex" xmlns:cx7="http://schemas.microsoft.com/office/drawing/2016/5/13/chartex" xmlns:cx8="http://schemas.microsoft.com/office/drawing/2016/5/14/chartex" xmlns:mc="http://schemas.openxmlformats.org/markup-compatibility/2006" xmlns:aink="http://schemas.microsoft.com/office/drawing/2016/ink" xmlns:am3d="http://schemas.microsoft.com/office/drawing/2017/model3d" xmlns:o="urn:schemas-microsoft-com:office:office" xmlns:oel="http://schemas.microsoft.com/office/2019/extlst" xmlns:r="http://schemas.openxmlformats.org/officeDocument/2006/relationships" xmlns:m="http://schemas.openxmlformats.org/officeDocument/2006/math" xmlns:v="urn:schemas-microsoft-com:vml" xmlns:wp14="http://schemas.microsoft.com/office/word/2010/wordprocessingDrawing" xmlns:wp="http://schemas.openxmlformats.org/drawingml/2006/wordprocessingDrawing" xmlns:w10="urn:schemas-microsoft-com:office:word" xmlns:w="http://schemas.openxmlformats.org/wordprocessingml/2006/main" xmlns:w14="http://schemas.microsoft.com/office/word/2010/wordml" xmlns:w15="http://schemas.microsoft.com/office/word/2012/wordml" xmlns:w16cex="http://schemas.microsoft.com/office/word/2018/wordml/cex" xmlns:w16cid="http://schemas.microsoft.com/office/word/2016/wordml/cid" xmlns:w16="http://schemas.microsoft.com/office/word/2018/wordml" xmlns:w16sdtdh="http://schemas.microsoft.com/office/word/2020/wordml/sdtdatahash" xmlns:w16se="http://schemas.microsoft.com/office/word/2015/wordml/symex" xmlns:wpg="http://schemas.microsoft.com/office/word/2010/wordprocessingGroup" xmlns:wpi="http://schemas.microsoft.com/office/word/2010/wordprocessingInk" xmlns:wne="http://schemas.microsoft.com/office/word/2006/wordml" xmlns:wps="http://schemas.microsoft.com/office/word/2010/wordprocessingShape" mc:Ignorable="w14 w15 w16se w16cid w16 w16cex w16sdtdh wp14">
+<w:endnotes xmlns:wpc="http://schemas.microsoft.com/office/word/2010/wordprocessingCanvas" xmlns:cx="http://schemas.microsoft.com/office/drawing/2014/chartex" xmlns:cx1="http://schemas.microsoft.com/office/drawing/2015/9/8/chartex" xmlns:cx2="http://schemas.microsoft.com/office/drawing/2015/10/21/chartex" xmlns:cx3="http://schemas.microsoft.com/office/drawing/2016/5/9/chartex" xmlns:cx4="http://schemas.microsoft.com/office/drawing/2016/5/10/chartex" xmlns:cx5="http://schemas.microsoft.com/office/drawing/2016/5/11/chartex" xmlns:cx6="http://schemas.microsoft.com/office/drawing/2016/5/12/chartex" xmlns:cx7="http://schemas.microsoft.com/office/drawing/2016/5/13/chartex" xmlns:cx8="http://schemas.microsoft.com/office/drawing/2016/5/14/chartex" xmlns:mc="http://schemas.openxmlformats.org/markup-compatibility/2006" xmlns:aink="http://schemas.microsoft.com/office/drawing/2016/ink" xmlns:am3d="http://schemas.microsoft.com/office/drawing/2017/model3d" xmlns:o="urn:schemas-microsoft-com:office:office" xmlns:oel="http://schemas.microsoft.com/office/2019/extlst" xmlns:r="http://schemas.openxmlformats.org/officeDocument/2006/relationships" xmlns:m="http://schemas.openxmlformats.org/officeDocument/2006/math" xmlns:v="urn:schemas-microsoft-com:vml" xmlns:wp14="http://schemas.microsoft.com/office/word/2010/wordprocessingDrawing" xmlns:wp="http://schemas.openxmlformats.org/drawingml/2006/wordprocessingDrawing" xmlns:w10="urn:schemas-microsoft-com:office:word" xmlns:w="http://schemas.openxmlformats.org/wordprocessingml/2006/main" xmlns:w14="http://schemas.microsoft.com/office/word/2010/wordml" xmlns:w15="http://schemas.microsoft.com/office/word/2012/wordml" xmlns:w16cex="http://schemas.microsoft.com/office/word/2018/wordml/cex" xmlns:w16cid="http://schemas.microsoft.com/office/word/2016/wordml/cid" xmlns:w16="http://schemas.microsoft.com/office/word/2018/wordml" xmlns:w16du="http://schemas.microsoft.com/office/word/2023/wordml/word16du" xmlns:w16sdtdh="http://schemas.microsoft.com/office/word/2020/wordml/sdtdatahash" xmlns:w16sdtfl="http://schemas.microsoft.com/office/word/2024/wordml/sdtformatlock" xmlns:w16se="http://schemas.microsoft.com/office/word/2015/wordml/symex" xmlns:wpg="http://schemas.microsoft.com/office/word/2010/wordprocessingGroup" xmlns:wpi="http://schemas.microsoft.com/office/word/2010/wordprocessingInk" xmlns:wne="http://schemas.microsoft.com/office/word/2006/wordml" xmlns:wps="http://schemas.microsoft.com/office/word/2010/wordprocessingShape" mc:Ignorable="w14 w15 w16se w16cid w16 w16cex w16sdtdh w16sdtfl w16du wp14">
   <w:endnote w:type="separator" w:id="-1">
     <w:p>
       <w:pPr>
@@ -1697,7 +2889,7 @@
 </file>
 
 <file path=word/footer1.xml><?xml version="1.0" encoding="utf-8"?>
-<w:ftr xmlns:wpc="http://schemas.microsoft.com/office/word/2010/wordprocessingCanvas" xmlns:cx="http://schemas.microsoft.com/office/drawing/2014/chartex" xmlns:cx1="http://schemas.microsoft.com/office/drawing/2015/9/8/chartex" xmlns:cx2="http://schemas.microsoft.com/office/drawing/2015/10/21/chartex" xmlns:cx3="http://schemas.microsoft.com/office/drawing/2016/5/9/chartex" xmlns:cx4="http://schemas.microsoft.com/office/drawing/2016/5/10/chartex" xmlns:cx5="http://schemas.microsoft.com/office/drawing/2016/5/11/chartex" xmlns:cx6="http://schemas.microsoft.com/office/drawing/2016/5/12/chartex" xmlns:cx7="http://schemas.microsoft.com/office/drawing/2016/5/13/chartex" xmlns:cx8="http://schemas.microsoft.com/office/drawing/2016/5/14/chartex" xmlns:mc="http://schemas.openxmlformats.org/markup-compatibility/2006" xmlns:aink="http://schemas.microsoft.com/office/drawing/2016/ink" xmlns:am3d="http://schemas.microsoft.com/office/drawing/2017/model3d" xmlns:o="urn:schemas-microsoft-com:office:office" xmlns:oel="http://schemas.microsoft.com/office/2019/extlst" xmlns:r="http://schemas.openxmlformats.org/officeDocument/2006/relationships" xmlns:m="http://schemas.openxmlformats.org/officeDocument/2006/math" xmlns:v="urn:schemas-microsoft-com:vml" xmlns:wp14="http://schemas.microsoft.com/office/word/2010/wordprocessingDrawing" xmlns:wp="http://schemas.openxmlformats.org/drawingml/2006/wordprocessingDrawing" xmlns:w10="urn:schemas-microsoft-com:office:word" xmlns:w="http://schemas.openxmlformats.org/wordprocessingml/2006/main" xmlns:w14="http://schemas.microsoft.com/office/word/2010/wordml" xmlns:w15="http://schemas.microsoft.com/office/word/2012/wordml" xmlns:w16cex="http://schemas.microsoft.com/office/word/2018/wordml/cex" xmlns:w16cid="http://schemas.microsoft.com/office/word/2016/wordml/cid" xmlns:w16="http://schemas.microsoft.com/office/word/2018/wordml" xmlns:w16sdtdh="http://schemas.microsoft.com/office/word/2020/wordml/sdtdatahash" xmlns:w16se="http://schemas.microsoft.com/office/word/2015/wordml/symex" xmlns:wpg="http://schemas.microsoft.com/office/word/2010/wordprocessingGroup" xmlns:wpi="http://schemas.microsoft.com/office/word/2010/wordprocessingInk" xmlns:wne="http://schemas.microsoft.com/office/word/2006/wordml" xmlns:wps="http://schemas.microsoft.com/office/word/2010/wordprocessingShape" mc:Ignorable="w14 w15 w16se w16cid w16 w16cex w16sdtdh wp14">
+<w:ftr xmlns:wpc="http://schemas.microsoft.com/office/word/2010/wordprocessingCanvas" xmlns:cx="http://schemas.microsoft.com/office/drawing/2014/chartex" xmlns:cx1="http://schemas.microsoft.com/office/drawing/2015/9/8/chartex" xmlns:cx2="http://schemas.microsoft.com/office/drawing/2015/10/21/chartex" xmlns:cx3="http://schemas.microsoft.com/office/drawing/2016/5/9/chartex" xmlns:cx4="http://schemas.microsoft.com/office/drawing/2016/5/10/chartex" xmlns:cx5="http://schemas.microsoft.com/office/drawing/2016/5/11/chartex" xmlns:cx6="http://schemas.microsoft.com/office/drawing/2016/5/12/chartex" xmlns:cx7="http://schemas.microsoft.com/office/drawing/2016/5/13/chartex" xmlns:cx8="http://schemas.microsoft.com/office/drawing/2016/5/14/chartex" xmlns:mc="http://schemas.openxmlformats.org/markup-compatibility/2006" xmlns:aink="http://schemas.microsoft.com/office/drawing/2016/ink" xmlns:am3d="http://schemas.microsoft.com/office/drawing/2017/model3d" xmlns:o="urn:schemas-microsoft-com:office:office" xmlns:oel="http://schemas.microsoft.com/office/2019/extlst" xmlns:r="http://schemas.openxmlformats.org/officeDocument/2006/relationships" xmlns:m="http://schemas.openxmlformats.org/officeDocument/2006/math" xmlns:v="urn:schemas-microsoft-com:vml" xmlns:wp14="http://schemas.microsoft.com/office/word/2010/wordprocessingDrawing" xmlns:wp="http://schemas.openxmlformats.org/drawingml/2006/wordprocessingDrawing" xmlns:w10="urn:schemas-microsoft-com:office:word" xmlns:w="http://schemas.openxmlformats.org/wordprocessingml/2006/main" xmlns:w14="http://schemas.microsoft.com/office/word/2010/wordml" xmlns:w15="http://schemas.microsoft.com/office/word/2012/wordml" xmlns:w16cex="http://schemas.microsoft.com/office/word/2018/wordml/cex" xmlns:w16cid="http://schemas.microsoft.com/office/word/2016/wordml/cid" xmlns:w16="http://schemas.microsoft.com/office/word/2018/wordml" xmlns:w16du="http://schemas.microsoft.com/office/word/2023/wordml/word16du" xmlns:w16sdtdh="http://schemas.microsoft.com/office/word/2020/wordml/sdtdatahash" xmlns:w16sdtfl="http://schemas.microsoft.com/office/word/2024/wordml/sdtformatlock" xmlns:w16se="http://schemas.microsoft.com/office/word/2015/wordml/symex" xmlns:wpg="http://schemas.microsoft.com/office/word/2010/wordprocessingGroup" xmlns:wpi="http://schemas.microsoft.com/office/word/2010/wordprocessingInk" xmlns:wne="http://schemas.microsoft.com/office/word/2006/wordml" xmlns:wps="http://schemas.microsoft.com/office/word/2010/wordprocessingShape" mc:Ignorable="w14 w15 w16se w16cid w16 w16cex w16sdtdh w16sdtfl w16du wp14">
   <w:sdt>
     <w:sdtPr>
       <w:rPr>
@@ -1749,7 +2941,7 @@
 </file>
 
 <file path=word/footer2.xml><?xml version="1.0" encoding="utf-8"?>
-<w:ftr xmlns:wpc="http://schemas.microsoft.com/office/word/2010/wordprocessingCanvas" xmlns:cx="http://schemas.microsoft.com/office/drawing/2014/chartex" xmlns:cx1="http://schemas.microsoft.com/office/drawing/2015/9/8/chartex" xmlns:cx2="http://schemas.microsoft.com/office/drawing/2015/10/21/chartex" xmlns:cx3="http://schemas.microsoft.com/office/drawing/2016/5/9/chartex" xmlns:cx4="http://schemas.microsoft.com/office/drawing/2016/5/10/chartex" xmlns:cx5="http://schemas.microsoft.com/office/drawing/2016/5/11/chartex" xmlns:cx6="http://schemas.microsoft.com/office/drawing/2016/5/12/chartex" xmlns:cx7="http://schemas.microsoft.com/office/drawing/2016/5/13/chartex" xmlns:cx8="http://schemas.microsoft.com/office/drawing/2016/5/14/chartex" xmlns:mc="http://schemas.openxmlformats.org/markup-compatibility/2006" xmlns:aink="http://schemas.microsoft.com/office/drawing/2016/ink" xmlns:am3d="http://schemas.microsoft.com/office/drawing/2017/model3d" xmlns:o="urn:schemas-microsoft-com:office:office" xmlns:oel="http://schemas.microsoft.com/office/2019/extlst" xmlns:r="http://schemas.openxmlformats.org/officeDocument/2006/relationships" xmlns:m="http://schemas.openxmlformats.org/officeDocument/2006/math" xmlns:v="urn:schemas-microsoft-com:vml" xmlns:wp14="http://schemas.microsoft.com/office/word/2010/wordprocessingDrawing" xmlns:wp="http://schemas.openxmlformats.org/drawingml/2006/wordprocessingDrawing" xmlns:w10="urn:schemas-microsoft-com:office:word" xmlns:w="http://schemas.openxmlformats.org/wordprocessingml/2006/main" xmlns:w14="http://schemas.microsoft.com/office/word/2010/wordml" xmlns:w15="http://schemas.microsoft.com/office/word/2012/wordml" xmlns:w16cex="http://schemas.microsoft.com/office/word/2018/wordml/cex" xmlns:w16cid="http://schemas.microsoft.com/office/word/2016/wordml/cid" xmlns:w16="http://schemas.microsoft.com/office/word/2018/wordml" xmlns:w16sdtdh="http://schemas.microsoft.com/office/word/2020/wordml/sdtdatahash" xmlns:w16se="http://schemas.microsoft.com/office/word/2015/wordml/symex" xmlns:wpg="http://schemas.microsoft.com/office/word/2010/wordprocessingGroup" xmlns:wpi="http://schemas.microsoft.com/office/word/2010/wordprocessingInk" xmlns:wne="http://schemas.microsoft.com/office/word/2006/wordml" xmlns:wps="http://schemas.microsoft.com/office/word/2010/wordprocessingShape" mc:Ignorable="w14 w15 w16se w16cid w16 w16cex w16sdtdh wp14">
+<w:ftr xmlns:wpc="http://schemas.microsoft.com/office/word/2010/wordprocessingCanvas" xmlns:cx="http://schemas.microsoft.com/office/drawing/2014/chartex" xmlns:cx1="http://schemas.microsoft.com/office/drawing/2015/9/8/chartex" xmlns:cx2="http://schemas.microsoft.com/office/drawing/2015/10/21/chartex" xmlns:cx3="http://schemas.microsoft.com/office/drawing/2016/5/9/chartex" xmlns:cx4="http://schemas.microsoft.com/office/drawing/2016/5/10/chartex" xmlns:cx5="http://schemas.microsoft.com/office/drawing/2016/5/11/chartex" xmlns:cx6="http://schemas.microsoft.com/office/drawing/2016/5/12/chartex" xmlns:cx7="http://schemas.microsoft.com/office/drawing/2016/5/13/chartex" xmlns:cx8="http://schemas.microsoft.com/office/drawing/2016/5/14/chartex" xmlns:mc="http://schemas.openxmlformats.org/markup-compatibility/2006" xmlns:aink="http://schemas.microsoft.com/office/drawing/2016/ink" xmlns:am3d="http://schemas.microsoft.com/office/drawing/2017/model3d" xmlns:o="urn:schemas-microsoft-com:office:office" xmlns:oel="http://schemas.microsoft.com/office/2019/extlst" xmlns:r="http://schemas.openxmlformats.org/officeDocument/2006/relationships" xmlns:m="http://schemas.openxmlformats.org/officeDocument/2006/math" xmlns:v="urn:schemas-microsoft-com:vml" xmlns:wp14="http://schemas.microsoft.com/office/word/2010/wordprocessingDrawing" xmlns:wp="http://schemas.openxmlformats.org/drawingml/2006/wordprocessingDrawing" xmlns:w10="urn:schemas-microsoft-com:office:word" xmlns:w="http://schemas.openxmlformats.org/wordprocessingml/2006/main" xmlns:w14="http://schemas.microsoft.com/office/word/2010/wordml" xmlns:w15="http://schemas.microsoft.com/office/word/2012/wordml" xmlns:w16cex="http://schemas.microsoft.com/office/word/2018/wordml/cex" xmlns:w16cid="http://schemas.microsoft.com/office/word/2016/wordml/cid" xmlns:w16="http://schemas.microsoft.com/office/word/2018/wordml" xmlns:w16du="http://schemas.microsoft.com/office/word/2023/wordml/word16du" xmlns:w16sdtdh="http://schemas.microsoft.com/office/word/2020/wordml/sdtdatahash" xmlns:w16sdtfl="http://schemas.microsoft.com/office/word/2024/wordml/sdtformatlock" xmlns:w16se="http://schemas.microsoft.com/office/word/2015/wordml/symex" xmlns:wpg="http://schemas.microsoft.com/office/word/2010/wordprocessingGroup" xmlns:wpi="http://schemas.microsoft.com/office/word/2010/wordprocessingInk" xmlns:wne="http://schemas.microsoft.com/office/word/2006/wordml" xmlns:wps="http://schemas.microsoft.com/office/word/2010/wordprocessingShape" mc:Ignorable="w14 w15 w16se w16cid w16 w16cex w16sdtdh w16sdtfl w16du wp14">
   <w:sdt>
     <w:sdtPr>
       <w:rPr>
@@ -1814,7 +3006,7 @@
 </file>
 
 <file path=word/footnotes.xml><?xml version="1.0" encoding="utf-8"?>
-<w:footnotes xmlns:wpc="http://schemas.microsoft.com/office/word/2010/wordprocessingCanvas" xmlns:cx="http://schemas.microsoft.com/office/drawing/2014/chartex" xmlns:cx1="http://schemas.microsoft.com/office/drawing/2015/9/8/chartex" xmlns:cx2="http://schemas.microsoft.com/office/drawing/2015/10/21/chartex" xmlns:cx3="http://schemas.microsoft.com/office/drawing/2016/5/9/chartex" xmlns:cx4="http://schemas.microsoft.com/office/drawing/2016/5/10/chartex" xmlns:cx5="http://schemas.microsoft.com/office/drawing/2016/5/11/chartex" xmlns:cx6="http://schemas.microsoft.com/office/drawing/2016/5/12/chartex" xmlns:cx7="http://schemas.microsoft.com/office/drawing/2016/5/13/chartex" xmlns:cx8="http://schemas.microsoft.com/office/drawing/2016/5/14/chartex" xmlns:mc="http://schemas.openxmlformats.org/markup-compatibility/2006" xmlns:aink="http://schemas.microsoft.com/office/drawing/2016/ink" xmlns:am3d="http://schemas.microsoft.com/office/drawing/2017/model3d" xmlns:o="urn:schemas-microsoft-com:office:office" xmlns:oel="http://schemas.microsoft.com/office/2019/extlst" xmlns:r="http://schemas.openxmlformats.org/officeDocument/2006/relationships" xmlns:m="http://schemas.openxmlformats.org/officeDocument/2006/math" xmlns:v="urn:schemas-microsoft-com:vml" xmlns:wp14="http://schemas.microsoft.com/office/word/2010/wordprocessingDrawing" xmlns:wp="http://schemas.openxmlformats.org/drawingml/2006/wordprocessingDrawing" xmlns:w10="urn:schemas-microsoft-com:office:word" xmlns:w="http://schemas.openxmlformats.org/wordprocessingml/2006/main" xmlns:w14="http://schemas.microsoft.com/office/word/2010/wordml" xmlns:w15="http://schemas.microsoft.com/office/word/2012/wordml" xmlns:w16cex="http://schemas.microsoft.com/office/word/2018/wordml/cex" xmlns:w16cid="http://schemas.microsoft.com/office/word/2016/wordml/cid" xmlns:w16="http://schemas.microsoft.com/office/word/2018/wordml" xmlns:w16sdtdh="http://schemas.microsoft.com/office/word/2020/wordml/sdtdatahash" xmlns:w16se="http://schemas.microsoft.com/office/word/2015/wordml/symex" xmlns:wpg="http://schemas.microsoft.com/office/word/2010/wordprocessingGroup" xmlns:wpi="http://schemas.microsoft.com/office/word/2010/wordprocessingInk" xmlns:wne="http://schemas.microsoft.com/office/word/2006/wordml" xmlns:wps="http://schemas.microsoft.com/office/word/2010/wordprocessingShape" mc:Ignorable="w14 w15 w16se w16cid w16 w16cex w16sdtdh wp14">
+<w:footnotes xmlns:wpc="http://schemas.microsoft.com/office/word/2010/wordprocessingCanvas" xmlns:cx="http://schemas.microsoft.com/office/drawing/2014/chartex" xmlns:cx1="http://schemas.microsoft.com/office/drawing/2015/9/8/chartex" xmlns:cx2="http://schemas.microsoft.com/office/drawing/2015/10/21/chartex" xmlns:cx3="http://schemas.microsoft.com/office/drawing/2016/5/9/chartex" xmlns:cx4="http://schemas.microsoft.com/office/drawing/2016/5/10/chartex" xmlns:cx5="http://schemas.microsoft.com/office/drawing/2016/5/11/chartex" xmlns:cx6="http://schemas.microsoft.com/office/drawing/2016/5/12/chartex" xmlns:cx7="http://schemas.microsoft.com/office/drawing/2016/5/13/chartex" xmlns:cx8="http://schemas.microsoft.com/office/drawing/2016/5/14/chartex" xmlns:mc="http://schemas.openxmlformats.org/markup-compatibility/2006" xmlns:aink="http://schemas.microsoft.com/office/drawing/2016/ink" xmlns:am3d="http://schemas.microsoft.com/office/drawing/2017/model3d" xmlns:o="urn:schemas-microsoft-com:office:office" xmlns:oel="http://schemas.microsoft.com/office/2019/extlst" xmlns:r="http://schemas.openxmlformats.org/officeDocument/2006/relationships" xmlns:m="http://schemas.openxmlformats.org/officeDocument/2006/math" xmlns:v="urn:schemas-microsoft-com:vml" xmlns:wp14="http://schemas.microsoft.com/office/word/2010/wordprocessingDrawing" xmlns:wp="http://schemas.openxmlformats.org/drawingml/2006/wordprocessingDrawing" xmlns:w10="urn:schemas-microsoft-com:office:word" xmlns:w="http://schemas.openxmlformats.org/wordprocessingml/2006/main" xmlns:w14="http://schemas.microsoft.com/office/word/2010/wordml" xmlns:w15="http://schemas.microsoft.com/office/word/2012/wordml" xmlns:w16cex="http://schemas.microsoft.com/office/word/2018/wordml/cex" xmlns:w16cid="http://schemas.microsoft.com/office/word/2016/wordml/cid" xmlns:w16="http://schemas.microsoft.com/office/word/2018/wordml" xmlns:w16du="http://schemas.microsoft.com/office/word/2023/wordml/word16du" xmlns:w16sdtdh="http://schemas.microsoft.com/office/word/2020/wordml/sdtdatahash" xmlns:w16sdtfl="http://schemas.microsoft.com/office/word/2024/wordml/sdtformatlock" xmlns:w16se="http://schemas.microsoft.com/office/word/2015/wordml/symex" xmlns:wpg="http://schemas.microsoft.com/office/word/2010/wordprocessingGroup" xmlns:wpi="http://schemas.microsoft.com/office/word/2010/wordprocessingInk" xmlns:wne="http://schemas.microsoft.com/office/word/2006/wordml" xmlns:wps="http://schemas.microsoft.com/office/word/2010/wordprocessingShape" mc:Ignorable="w14 w15 w16se w16cid w16 w16cex w16sdtdh w16sdtfl w16du wp14">
   <w:footnote w:type="separator" w:id="-1">
     <w:p>
       <w:pPr>
@@ -1839,7 +3031,7 @@
 </file>
 
 <file path=word/header1.xml><?xml version="1.0" encoding="utf-8"?>
-<w:hdr xmlns:wpc="http://schemas.microsoft.com/office/word/2010/wordprocessingCanvas" xmlns:cx="http://schemas.microsoft.com/office/drawing/2014/chartex" xmlns:cx1="http://schemas.microsoft.com/office/drawing/2015/9/8/chartex" xmlns:cx2="http://schemas.microsoft.com/office/drawing/2015/10/21/chartex" xmlns:cx3="http://schemas.microsoft.com/office/drawing/2016/5/9/chartex" xmlns:cx4="http://schemas.microsoft.com/office/drawing/2016/5/10/chartex" xmlns:cx5="http://schemas.microsoft.com/office/drawing/2016/5/11/chartex" xmlns:cx6="http://schemas.microsoft.com/office/drawing/2016/5/12/chartex" xmlns:cx7="http://schemas.microsoft.com/office/drawing/2016/5/13/chartex" xmlns:cx8="http://schemas.microsoft.com/office/drawing/2016/5/14/chartex" xmlns:mc="http://schemas.openxmlformats.org/markup-compatibility/2006" xmlns:aink="http://schemas.microsoft.com/office/drawing/2016/ink" xmlns:am3d="http://schemas.microsoft.com/office/drawing/2017/model3d" xmlns:o="urn:schemas-microsoft-com:office:office" xmlns:oel="http://schemas.microsoft.com/office/2019/extlst" xmlns:r="http://schemas.openxmlformats.org/officeDocument/2006/relationships" xmlns:m="http://schemas.openxmlformats.org/officeDocument/2006/math" xmlns:v="urn:schemas-microsoft-com:vml" xmlns:wp14="http://schemas.microsoft.com/office/word/2010/wordprocessingDrawing" xmlns:wp="http://schemas.openxmlformats.org/drawingml/2006/wordprocessingDrawing" xmlns:w10="urn:schemas-microsoft-com:office:word" xmlns:w="http://schemas.openxmlformats.org/wordprocessingml/2006/main" xmlns:w14="http://schemas.microsoft.com/office/word/2010/wordml" xmlns:w15="http://schemas.microsoft.com/office/word/2012/wordml" xmlns:w16cex="http://schemas.microsoft.com/office/word/2018/wordml/cex" xmlns:w16cid="http://schemas.microsoft.com/office/word/2016/wordml/cid" xmlns:w16="http://schemas.microsoft.com/office/word/2018/wordml" xmlns:w16sdtdh="http://schemas.microsoft.com/office/word/2020/wordml/sdtdatahash" xmlns:w16se="http://schemas.microsoft.com/office/word/2015/wordml/symex" xmlns:wpg="http://schemas.microsoft.com/office/word/2010/wordprocessingGroup" xmlns:wpi="http://schemas.microsoft.com/office/word/2010/wordprocessingInk" xmlns:wne="http://schemas.microsoft.com/office/word/2006/wordml" xmlns:wps="http://schemas.microsoft.com/office/word/2010/wordprocessingShape" mc:Ignorable="w14 w15 w16se w16cid w16 w16cex w16sdtdh wp14">
+<w:hdr xmlns:wpc="http://schemas.microsoft.com/office/word/2010/wordprocessingCanvas" xmlns:cx="http://schemas.microsoft.com/office/drawing/2014/chartex" xmlns:cx1="http://schemas.microsoft.com/office/drawing/2015/9/8/chartex" xmlns:cx2="http://schemas.microsoft.com/office/drawing/2015/10/21/chartex" xmlns:cx3="http://schemas.microsoft.com/office/drawing/2016/5/9/chartex" xmlns:cx4="http://schemas.microsoft.com/office/drawing/2016/5/10/chartex" xmlns:cx5="http://schemas.microsoft.com/office/drawing/2016/5/11/chartex" xmlns:cx6="http://schemas.microsoft.com/office/drawing/2016/5/12/chartex" xmlns:cx7="http://schemas.microsoft.com/office/drawing/2016/5/13/chartex" xmlns:cx8="http://schemas.microsoft.com/office/drawing/2016/5/14/chartex" xmlns:mc="http://schemas.openxmlformats.org/markup-compatibility/2006" xmlns:aink="http://schemas.microsoft.com/office/drawing/2016/ink" xmlns:am3d="http://schemas.microsoft.com/office/drawing/2017/model3d" xmlns:o="urn:schemas-microsoft-com:office:office" xmlns:oel="http://schemas.microsoft.com/office/2019/extlst" xmlns:r="http://schemas.openxmlformats.org/officeDocument/2006/relationships" xmlns:m="http://schemas.openxmlformats.org/officeDocument/2006/math" xmlns:v="urn:schemas-microsoft-com:vml" xmlns:wp14="http://schemas.microsoft.com/office/word/2010/wordprocessingDrawing" xmlns:wp="http://schemas.openxmlformats.org/drawingml/2006/wordprocessingDrawing" xmlns:w10="urn:schemas-microsoft-com:office:word" xmlns:w="http://schemas.openxmlformats.org/wordprocessingml/2006/main" xmlns:w14="http://schemas.microsoft.com/office/word/2010/wordml" xmlns:w15="http://schemas.microsoft.com/office/word/2012/wordml" xmlns:w16cex="http://schemas.microsoft.com/office/word/2018/wordml/cex" xmlns:w16cid="http://schemas.microsoft.com/office/word/2016/wordml/cid" xmlns:w16="http://schemas.microsoft.com/office/word/2018/wordml" xmlns:w16du="http://schemas.microsoft.com/office/word/2023/wordml/word16du" xmlns:w16sdtdh="http://schemas.microsoft.com/office/word/2020/wordml/sdtdatahash" xmlns:w16sdtfl="http://schemas.microsoft.com/office/word/2024/wordml/sdtformatlock" xmlns:w16se="http://schemas.microsoft.com/office/word/2015/wordml/symex" xmlns:wpg="http://schemas.microsoft.com/office/word/2010/wordprocessingGroup" xmlns:wpi="http://schemas.microsoft.com/office/word/2010/wordprocessingInk" xmlns:wne="http://schemas.microsoft.com/office/word/2006/wordml" xmlns:wps="http://schemas.microsoft.com/office/word/2010/wordprocessingShape" mc:Ignorable="w14 w15 w16se w16cid w16 w16cex w16sdtdh w16sdtfl w16du wp14">
   <w:p>
     <w:pPr>
       <w:pStyle w:val="Header"/>
@@ -1856,8 +3048,121 @@
 </file>
 
 <file path=word/numbering.xml><?xml version="1.0" encoding="utf-8"?>
-<w:numbering xmlns:wpc="http://schemas.microsoft.com/office/word/2010/wordprocessingCanvas" xmlns:cx="http://schemas.microsoft.com/office/drawing/2014/chartex" xmlns:cx1="http://schemas.microsoft.com/office/drawing/2015/9/8/chartex" xmlns:cx2="http://schemas.microsoft.com/office/drawing/2015/10/21/chartex" xmlns:cx3="http://schemas.microsoft.com/office/drawing/2016/5/9/chartex" xmlns:cx4="http://schemas.microsoft.com/office/drawing/2016/5/10/chartex" xmlns:cx5="http://schemas.microsoft.com/office/drawing/2016/5/11/chartex" xmlns:cx6="http://schemas.microsoft.com/office/drawing/2016/5/12/chartex" xmlns:cx7="http://schemas.microsoft.com/office/drawing/2016/5/13/chartex" xmlns:cx8="http://schemas.microsoft.com/office/drawing/2016/5/14/chartex" xmlns:mc="http://schemas.openxmlformats.org/markup-compatibility/2006" xmlns:aink="http://schemas.microsoft.com/office/drawing/2016/ink" xmlns:am3d="http://schemas.microsoft.com/office/drawing/2017/model3d" xmlns:o="urn:schemas-microsoft-com:office:office" xmlns:oel="http://schemas.microsoft.com/office/2019/extlst" xmlns:r="http://schemas.openxmlformats.org/officeDocument/2006/relationships" xmlns:m="http://schemas.openxmlformats.org/officeDocument/2006/math" xmlns:v="urn:schemas-microsoft-com:vml" xmlns:wp14="http://schemas.microsoft.com/office/word/2010/wordprocessingDrawing" xmlns:wp="http://schemas.openxmlformats.org/drawingml/2006/wordprocessingDrawing" xmlns:w10="urn:schemas-microsoft-com:office:word" xmlns:w="http://schemas.openxmlformats.org/wordprocessingml/2006/main" xmlns:w14="http://schemas.microsoft.com/office/word/2010/wordml" xmlns:w15="http://schemas.microsoft.com/office/word/2012/wordml" xmlns:w16cex="http://schemas.microsoft.com/office/word/2018/wordml/cex" xmlns:w16cid="http://schemas.microsoft.com/office/word/2016/wordml/cid" xmlns:w16="http://schemas.microsoft.com/office/word/2018/wordml" xmlns:w16sdtdh="http://schemas.microsoft.com/office/word/2020/wordml/sdtdatahash" xmlns:w16se="http://schemas.microsoft.com/office/word/2015/wordml/symex" xmlns:wpg="http://schemas.microsoft.com/office/word/2010/wordprocessingGroup" xmlns:wpi="http://schemas.microsoft.com/office/word/2010/wordprocessingInk" xmlns:wne="http://schemas.microsoft.com/office/word/2006/wordml" xmlns:wps="http://schemas.microsoft.com/office/word/2010/wordprocessingShape" mc:Ignorable="w14 w15 w16se w16cid w16 w16cex w16sdtdh wp14">
+<w:numbering xmlns:wpc="http://schemas.microsoft.com/office/word/2010/wordprocessingCanvas" xmlns:cx="http://schemas.microsoft.com/office/drawing/2014/chartex" xmlns:cx1="http://schemas.microsoft.com/office/drawing/2015/9/8/chartex" xmlns:cx2="http://schemas.microsoft.com/office/drawing/2015/10/21/chartex" xmlns:cx3="http://schemas.microsoft.com/office/drawing/2016/5/9/chartex" xmlns:cx4="http://schemas.microsoft.com/office/drawing/2016/5/10/chartex" xmlns:cx5="http://schemas.microsoft.com/office/drawing/2016/5/11/chartex" xmlns:cx6="http://schemas.microsoft.com/office/drawing/2016/5/12/chartex" xmlns:cx7="http://schemas.microsoft.com/office/drawing/2016/5/13/chartex" xmlns:cx8="http://schemas.microsoft.com/office/drawing/2016/5/14/chartex" xmlns:mc="http://schemas.openxmlformats.org/markup-compatibility/2006" xmlns:aink="http://schemas.microsoft.com/office/drawing/2016/ink" xmlns:am3d="http://schemas.microsoft.com/office/drawing/2017/model3d" xmlns:o="urn:schemas-microsoft-com:office:office" xmlns:oel="http://schemas.microsoft.com/office/2019/extlst" xmlns:r="http://schemas.openxmlformats.org/officeDocument/2006/relationships" xmlns:m="http://schemas.openxmlformats.org/officeDocument/2006/math" xmlns:v="urn:schemas-microsoft-com:vml" xmlns:wp14="http://schemas.microsoft.com/office/word/2010/wordprocessingDrawing" xmlns:wp="http://schemas.openxmlformats.org/drawingml/2006/wordprocessingDrawing" xmlns:w10="urn:schemas-microsoft-com:office:word" xmlns:w="http://schemas.openxmlformats.org/wordprocessingml/2006/main" xmlns:w14="http://schemas.microsoft.com/office/word/2010/wordml" xmlns:w15="http://schemas.microsoft.com/office/word/2012/wordml" xmlns:w16cex="http://schemas.microsoft.com/office/word/2018/wordml/cex" xmlns:w16cid="http://schemas.microsoft.com/office/word/2016/wordml/cid" xmlns:w16="http://schemas.microsoft.com/office/word/2018/wordml" xmlns:w16du="http://schemas.microsoft.com/office/word/2023/wordml/word16du" xmlns:w16sdtdh="http://schemas.microsoft.com/office/word/2020/wordml/sdtdatahash" xmlns:w16sdtfl="http://schemas.microsoft.com/office/word/2024/wordml/sdtformatlock" xmlns:w16se="http://schemas.microsoft.com/office/word/2015/wordml/symex" xmlns:wpg="http://schemas.microsoft.com/office/word/2010/wordprocessingGroup" xmlns:wpi="http://schemas.microsoft.com/office/word/2010/wordprocessingInk" xmlns:wne="http://schemas.microsoft.com/office/word/2006/wordml" xmlns:wps="http://schemas.microsoft.com/office/word/2010/wordprocessingShape" mc:Ignorable="w14 w15 w16se w16cid w16 w16cex w16sdtdh w16sdtfl w16du wp14">
   <w:abstractNum w:abstractNumId="0" w15:restartNumberingAfterBreak="0">
+    <w:nsid w:val="0C391F0A"/>
+    <w:multiLevelType w:val="hybridMultilevel"/>
+    <w:tmpl w:val="E004A0E6"/>
+    <w:lvl w:ilvl="0" w:tplc="04090001">
+      <w:start w:val="1"/>
+      <w:numFmt w:val="bullet"/>
+      <w:lvlText w:val=""/>
+      <w:lvlJc w:val="left"/>
+      <w:pPr>
+        <w:ind w:left="720" w:hanging="360"/>
+      </w:pPr>
+      <w:rPr>
+        <w:rFonts w:ascii="Symbol" w:hAnsi="Symbol" w:hint="default"/>
+      </w:rPr>
+    </w:lvl>
+    <w:lvl w:ilvl="1" w:tplc="04090003" w:tentative="1">
+      <w:start w:val="1"/>
+      <w:numFmt w:val="bullet"/>
+      <w:lvlText w:val="o"/>
+      <w:lvlJc w:val="left"/>
+      <w:pPr>
+        <w:ind w:left="1440" w:hanging="360"/>
+      </w:pPr>
+      <w:rPr>
+        <w:rFonts w:ascii="Courier New" w:hAnsi="Courier New" w:cs="Courier New" w:hint="default"/>
+      </w:rPr>
+    </w:lvl>
+    <w:lvl w:ilvl="2" w:tplc="04090005" w:tentative="1">
+      <w:start w:val="1"/>
+      <w:numFmt w:val="bullet"/>
+      <w:lvlText w:val=""/>
+      <w:lvlJc w:val="left"/>
+      <w:pPr>
+        <w:ind w:left="2160" w:hanging="360"/>
+      </w:pPr>
+      <w:rPr>
+        <w:rFonts w:ascii="Wingdings" w:hAnsi="Wingdings" w:hint="default"/>
+      </w:rPr>
+    </w:lvl>
+    <w:lvl w:ilvl="3" w:tplc="04090001" w:tentative="1">
+      <w:start w:val="1"/>
+      <w:numFmt w:val="bullet"/>
+      <w:lvlText w:val=""/>
+      <w:lvlJc w:val="left"/>
+      <w:pPr>
+        <w:ind w:left="2880" w:hanging="360"/>
+      </w:pPr>
+      <w:rPr>
+        <w:rFonts w:ascii="Symbol" w:hAnsi="Symbol" w:hint="default"/>
+      </w:rPr>
+    </w:lvl>
+    <w:lvl w:ilvl="4" w:tplc="04090003" w:tentative="1">
+      <w:start w:val="1"/>
+      <w:numFmt w:val="bullet"/>
+      <w:lvlText w:val="o"/>
+      <w:lvlJc w:val="left"/>
+      <w:pPr>
+        <w:ind w:left="3600" w:hanging="360"/>
+      </w:pPr>
+      <w:rPr>
+        <w:rFonts w:ascii="Courier New" w:hAnsi="Courier New" w:cs="Courier New" w:hint="default"/>
+      </w:rPr>
+    </w:lvl>
+    <w:lvl w:ilvl="5" w:tplc="04090005" w:tentative="1">
+      <w:start w:val="1"/>
+      <w:numFmt w:val="bullet"/>
+      <w:lvlText w:val=""/>
+      <w:lvlJc w:val="left"/>
+      <w:pPr>
+        <w:ind w:left="4320" w:hanging="360"/>
+      </w:pPr>
+      <w:rPr>
+        <w:rFonts w:ascii="Wingdings" w:hAnsi="Wingdings" w:hint="default"/>
+      </w:rPr>
+    </w:lvl>
+    <w:lvl w:ilvl="6" w:tplc="04090001" w:tentative="1">
+      <w:start w:val="1"/>
+      <w:numFmt w:val="bullet"/>
+      <w:lvlText w:val=""/>
+      <w:lvlJc w:val="left"/>
+      <w:pPr>
+        <w:ind w:left="5040" w:hanging="360"/>
+      </w:pPr>
+      <w:rPr>
+        <w:rFonts w:ascii="Symbol" w:hAnsi="Symbol" w:hint="default"/>
+      </w:rPr>
+    </w:lvl>
+    <w:lvl w:ilvl="7" w:tplc="04090003" w:tentative="1">
+      <w:start w:val="1"/>
+      <w:numFmt w:val="bullet"/>
+      <w:lvlText w:val="o"/>
+      <w:lvlJc w:val="left"/>
+      <w:pPr>
+        <w:ind w:left="5760" w:hanging="360"/>
+      </w:pPr>
+      <w:rPr>
+        <w:rFonts w:ascii="Courier New" w:hAnsi="Courier New" w:cs="Courier New" w:hint="default"/>
+      </w:rPr>
+    </w:lvl>
+    <w:lvl w:ilvl="8" w:tplc="04090005" w:tentative="1">
+      <w:start w:val="1"/>
+      <w:numFmt w:val="bullet"/>
+      <w:lvlText w:val=""/>
+      <w:lvlJc w:val="left"/>
+      <w:pPr>
+        <w:ind w:left="6480" w:hanging="360"/>
+      </w:pPr>
+      <w:rPr>
+        <w:rFonts w:ascii="Wingdings" w:hAnsi="Wingdings" w:hint="default"/>
+      </w:rPr>
+    </w:lvl>
+  </w:abstractNum>
+  <w:abstractNum w:abstractNumId="1" w15:restartNumberingAfterBreak="0">
     <w:nsid w:val="293F1DE6"/>
     <w:multiLevelType w:val="hybridMultilevel"/>
     <w:tmpl w:val="4FDAF274"/>
@@ -1943,14 +3248,575 @@
       </w:pPr>
     </w:lvl>
   </w:abstractNum>
+  <w:abstractNum w:abstractNumId="2" w15:restartNumberingAfterBreak="0">
+    <w:nsid w:val="30E92694"/>
+    <w:multiLevelType w:val="hybridMultilevel"/>
+    <w:tmpl w:val="473409EA"/>
+    <w:lvl w:ilvl="0" w:tplc="04090001">
+      <w:start w:val="1"/>
+      <w:numFmt w:val="bullet"/>
+      <w:lvlText w:val=""/>
+      <w:lvlJc w:val="left"/>
+      <w:pPr>
+        <w:ind w:left="720" w:hanging="360"/>
+      </w:pPr>
+      <w:rPr>
+        <w:rFonts w:ascii="Symbol" w:hAnsi="Symbol" w:hint="default"/>
+      </w:rPr>
+    </w:lvl>
+    <w:lvl w:ilvl="1" w:tplc="04090003" w:tentative="1">
+      <w:start w:val="1"/>
+      <w:numFmt w:val="bullet"/>
+      <w:lvlText w:val="o"/>
+      <w:lvlJc w:val="left"/>
+      <w:pPr>
+        <w:ind w:left="1440" w:hanging="360"/>
+      </w:pPr>
+      <w:rPr>
+        <w:rFonts w:ascii="Courier New" w:hAnsi="Courier New" w:cs="Courier New" w:hint="default"/>
+      </w:rPr>
+    </w:lvl>
+    <w:lvl w:ilvl="2" w:tplc="04090005" w:tentative="1">
+      <w:start w:val="1"/>
+      <w:numFmt w:val="bullet"/>
+      <w:lvlText w:val=""/>
+      <w:lvlJc w:val="left"/>
+      <w:pPr>
+        <w:ind w:left="2160" w:hanging="360"/>
+      </w:pPr>
+      <w:rPr>
+        <w:rFonts w:ascii="Wingdings" w:hAnsi="Wingdings" w:hint="default"/>
+      </w:rPr>
+    </w:lvl>
+    <w:lvl w:ilvl="3" w:tplc="04090001" w:tentative="1">
+      <w:start w:val="1"/>
+      <w:numFmt w:val="bullet"/>
+      <w:lvlText w:val=""/>
+      <w:lvlJc w:val="left"/>
+      <w:pPr>
+        <w:ind w:left="2880" w:hanging="360"/>
+      </w:pPr>
+      <w:rPr>
+        <w:rFonts w:ascii="Symbol" w:hAnsi="Symbol" w:hint="default"/>
+      </w:rPr>
+    </w:lvl>
+    <w:lvl w:ilvl="4" w:tplc="04090003" w:tentative="1">
+      <w:start w:val="1"/>
+      <w:numFmt w:val="bullet"/>
+      <w:lvlText w:val="o"/>
+      <w:lvlJc w:val="left"/>
+      <w:pPr>
+        <w:ind w:left="3600" w:hanging="360"/>
+      </w:pPr>
+      <w:rPr>
+        <w:rFonts w:ascii="Courier New" w:hAnsi="Courier New" w:cs="Courier New" w:hint="default"/>
+      </w:rPr>
+    </w:lvl>
+    <w:lvl w:ilvl="5" w:tplc="04090005" w:tentative="1">
+      <w:start w:val="1"/>
+      <w:numFmt w:val="bullet"/>
+      <w:lvlText w:val=""/>
+      <w:lvlJc w:val="left"/>
+      <w:pPr>
+        <w:ind w:left="4320" w:hanging="360"/>
+      </w:pPr>
+      <w:rPr>
+        <w:rFonts w:ascii="Wingdings" w:hAnsi="Wingdings" w:hint="default"/>
+      </w:rPr>
+    </w:lvl>
+    <w:lvl w:ilvl="6" w:tplc="04090001" w:tentative="1">
+      <w:start w:val="1"/>
+      <w:numFmt w:val="bullet"/>
+      <w:lvlText w:val=""/>
+      <w:lvlJc w:val="left"/>
+      <w:pPr>
+        <w:ind w:left="5040" w:hanging="360"/>
+      </w:pPr>
+      <w:rPr>
+        <w:rFonts w:ascii="Symbol" w:hAnsi="Symbol" w:hint="default"/>
+      </w:rPr>
+    </w:lvl>
+    <w:lvl w:ilvl="7" w:tplc="04090003" w:tentative="1">
+      <w:start w:val="1"/>
+      <w:numFmt w:val="bullet"/>
+      <w:lvlText w:val="o"/>
+      <w:lvlJc w:val="left"/>
+      <w:pPr>
+        <w:ind w:left="5760" w:hanging="360"/>
+      </w:pPr>
+      <w:rPr>
+        <w:rFonts w:ascii="Courier New" w:hAnsi="Courier New" w:cs="Courier New" w:hint="default"/>
+      </w:rPr>
+    </w:lvl>
+    <w:lvl w:ilvl="8" w:tplc="04090005" w:tentative="1">
+      <w:start w:val="1"/>
+      <w:numFmt w:val="bullet"/>
+      <w:lvlText w:val=""/>
+      <w:lvlJc w:val="left"/>
+      <w:pPr>
+        <w:ind w:left="6480" w:hanging="360"/>
+      </w:pPr>
+      <w:rPr>
+        <w:rFonts w:ascii="Wingdings" w:hAnsi="Wingdings" w:hint="default"/>
+      </w:rPr>
+    </w:lvl>
+  </w:abstractNum>
+  <w:abstractNum w:abstractNumId="3" w15:restartNumberingAfterBreak="0">
+    <w:nsid w:val="30F42EAD"/>
+    <w:multiLevelType w:val="hybridMultilevel"/>
+    <w:tmpl w:val="A4249820"/>
+    <w:lvl w:ilvl="0" w:tplc="04090001">
+      <w:start w:val="1"/>
+      <w:numFmt w:val="bullet"/>
+      <w:lvlText w:val=""/>
+      <w:lvlJc w:val="left"/>
+      <w:pPr>
+        <w:ind w:left="720" w:hanging="360"/>
+      </w:pPr>
+      <w:rPr>
+        <w:rFonts w:ascii="Symbol" w:hAnsi="Symbol" w:hint="default"/>
+      </w:rPr>
+    </w:lvl>
+    <w:lvl w:ilvl="1" w:tplc="04090003" w:tentative="1">
+      <w:start w:val="1"/>
+      <w:numFmt w:val="bullet"/>
+      <w:lvlText w:val="o"/>
+      <w:lvlJc w:val="left"/>
+      <w:pPr>
+        <w:ind w:left="1440" w:hanging="360"/>
+      </w:pPr>
+      <w:rPr>
+        <w:rFonts w:ascii="Courier New" w:hAnsi="Courier New" w:cs="Courier New" w:hint="default"/>
+      </w:rPr>
+    </w:lvl>
+    <w:lvl w:ilvl="2" w:tplc="04090005" w:tentative="1">
+      <w:start w:val="1"/>
+      <w:numFmt w:val="bullet"/>
+      <w:lvlText w:val=""/>
+      <w:lvlJc w:val="left"/>
+      <w:pPr>
+        <w:ind w:left="2160" w:hanging="360"/>
+      </w:pPr>
+      <w:rPr>
+        <w:rFonts w:ascii="Wingdings" w:hAnsi="Wingdings" w:hint="default"/>
+      </w:rPr>
+    </w:lvl>
+    <w:lvl w:ilvl="3" w:tplc="04090001" w:tentative="1">
+      <w:start w:val="1"/>
+      <w:numFmt w:val="bullet"/>
+      <w:lvlText w:val=""/>
+      <w:lvlJc w:val="left"/>
+      <w:pPr>
+        <w:ind w:left="2880" w:hanging="360"/>
+      </w:pPr>
+      <w:rPr>
+        <w:rFonts w:ascii="Symbol" w:hAnsi="Symbol" w:hint="default"/>
+      </w:rPr>
+    </w:lvl>
+    <w:lvl w:ilvl="4" w:tplc="04090003" w:tentative="1">
+      <w:start w:val="1"/>
+      <w:numFmt w:val="bullet"/>
+      <w:lvlText w:val="o"/>
+      <w:lvlJc w:val="left"/>
+      <w:pPr>
+        <w:ind w:left="3600" w:hanging="360"/>
+      </w:pPr>
+      <w:rPr>
+        <w:rFonts w:ascii="Courier New" w:hAnsi="Courier New" w:cs="Courier New" w:hint="default"/>
+      </w:rPr>
+    </w:lvl>
+    <w:lvl w:ilvl="5" w:tplc="04090005" w:tentative="1">
+      <w:start w:val="1"/>
+      <w:numFmt w:val="bullet"/>
+      <w:lvlText w:val=""/>
+      <w:lvlJc w:val="left"/>
+      <w:pPr>
+        <w:ind w:left="4320" w:hanging="360"/>
+      </w:pPr>
+      <w:rPr>
+        <w:rFonts w:ascii="Wingdings" w:hAnsi="Wingdings" w:hint="default"/>
+      </w:rPr>
+    </w:lvl>
+    <w:lvl w:ilvl="6" w:tplc="04090001" w:tentative="1">
+      <w:start w:val="1"/>
+      <w:numFmt w:val="bullet"/>
+      <w:lvlText w:val=""/>
+      <w:lvlJc w:val="left"/>
+      <w:pPr>
+        <w:ind w:left="5040" w:hanging="360"/>
+      </w:pPr>
+      <w:rPr>
+        <w:rFonts w:ascii="Symbol" w:hAnsi="Symbol" w:hint="default"/>
+      </w:rPr>
+    </w:lvl>
+    <w:lvl w:ilvl="7" w:tplc="04090003" w:tentative="1">
+      <w:start w:val="1"/>
+      <w:numFmt w:val="bullet"/>
+      <w:lvlText w:val="o"/>
+      <w:lvlJc w:val="left"/>
+      <w:pPr>
+        <w:ind w:left="5760" w:hanging="360"/>
+      </w:pPr>
+      <w:rPr>
+        <w:rFonts w:ascii="Courier New" w:hAnsi="Courier New" w:cs="Courier New" w:hint="default"/>
+      </w:rPr>
+    </w:lvl>
+    <w:lvl w:ilvl="8" w:tplc="04090005" w:tentative="1">
+      <w:start w:val="1"/>
+      <w:numFmt w:val="bullet"/>
+      <w:lvlText w:val=""/>
+      <w:lvlJc w:val="left"/>
+      <w:pPr>
+        <w:ind w:left="6480" w:hanging="360"/>
+      </w:pPr>
+      <w:rPr>
+        <w:rFonts w:ascii="Wingdings" w:hAnsi="Wingdings" w:hint="default"/>
+      </w:rPr>
+    </w:lvl>
+  </w:abstractNum>
+  <w:abstractNum w:abstractNumId="4" w15:restartNumberingAfterBreak="0">
+    <w:nsid w:val="512B267E"/>
+    <w:multiLevelType w:val="hybridMultilevel"/>
+    <w:tmpl w:val="E65AC548"/>
+    <w:lvl w:ilvl="0" w:tplc="04090001">
+      <w:start w:val="1"/>
+      <w:numFmt w:val="bullet"/>
+      <w:lvlText w:val=""/>
+      <w:lvlJc w:val="left"/>
+      <w:pPr>
+        <w:ind w:left="720" w:hanging="360"/>
+      </w:pPr>
+      <w:rPr>
+        <w:rFonts w:ascii="Symbol" w:hAnsi="Symbol" w:hint="default"/>
+      </w:rPr>
+    </w:lvl>
+    <w:lvl w:ilvl="1" w:tplc="04090003" w:tentative="1">
+      <w:start w:val="1"/>
+      <w:numFmt w:val="bullet"/>
+      <w:lvlText w:val="o"/>
+      <w:lvlJc w:val="left"/>
+      <w:pPr>
+        <w:ind w:left="1440" w:hanging="360"/>
+      </w:pPr>
+      <w:rPr>
+        <w:rFonts w:ascii="Courier New" w:hAnsi="Courier New" w:cs="Courier New" w:hint="default"/>
+      </w:rPr>
+    </w:lvl>
+    <w:lvl w:ilvl="2" w:tplc="04090005" w:tentative="1">
+      <w:start w:val="1"/>
+      <w:numFmt w:val="bullet"/>
+      <w:lvlText w:val=""/>
+      <w:lvlJc w:val="left"/>
+      <w:pPr>
+        <w:ind w:left="2160" w:hanging="360"/>
+      </w:pPr>
+      <w:rPr>
+        <w:rFonts w:ascii="Wingdings" w:hAnsi="Wingdings" w:hint="default"/>
+      </w:rPr>
+    </w:lvl>
+    <w:lvl w:ilvl="3" w:tplc="04090001" w:tentative="1">
+      <w:start w:val="1"/>
+      <w:numFmt w:val="bullet"/>
+      <w:lvlText w:val=""/>
+      <w:lvlJc w:val="left"/>
+      <w:pPr>
+        <w:ind w:left="2880" w:hanging="360"/>
+      </w:pPr>
+      <w:rPr>
+        <w:rFonts w:ascii="Symbol" w:hAnsi="Symbol" w:hint="default"/>
+      </w:rPr>
+    </w:lvl>
+    <w:lvl w:ilvl="4" w:tplc="04090003" w:tentative="1">
+      <w:start w:val="1"/>
+      <w:numFmt w:val="bullet"/>
+      <w:lvlText w:val="o"/>
+      <w:lvlJc w:val="left"/>
+      <w:pPr>
+        <w:ind w:left="3600" w:hanging="360"/>
+      </w:pPr>
+      <w:rPr>
+        <w:rFonts w:ascii="Courier New" w:hAnsi="Courier New" w:cs="Courier New" w:hint="default"/>
+      </w:rPr>
+    </w:lvl>
+    <w:lvl w:ilvl="5" w:tplc="04090005" w:tentative="1">
+      <w:start w:val="1"/>
+      <w:numFmt w:val="bullet"/>
+      <w:lvlText w:val=""/>
+      <w:lvlJc w:val="left"/>
+      <w:pPr>
+        <w:ind w:left="4320" w:hanging="360"/>
+      </w:pPr>
+      <w:rPr>
+        <w:rFonts w:ascii="Wingdings" w:hAnsi="Wingdings" w:hint="default"/>
+      </w:rPr>
+    </w:lvl>
+    <w:lvl w:ilvl="6" w:tplc="04090001" w:tentative="1">
+      <w:start w:val="1"/>
+      <w:numFmt w:val="bullet"/>
+      <w:lvlText w:val=""/>
+      <w:lvlJc w:val="left"/>
+      <w:pPr>
+        <w:ind w:left="5040" w:hanging="360"/>
+      </w:pPr>
+      <w:rPr>
+        <w:rFonts w:ascii="Symbol" w:hAnsi="Symbol" w:hint="default"/>
+      </w:rPr>
+    </w:lvl>
+    <w:lvl w:ilvl="7" w:tplc="04090003" w:tentative="1">
+      <w:start w:val="1"/>
+      <w:numFmt w:val="bullet"/>
+      <w:lvlText w:val="o"/>
+      <w:lvlJc w:val="left"/>
+      <w:pPr>
+        <w:ind w:left="5760" w:hanging="360"/>
+      </w:pPr>
+      <w:rPr>
+        <w:rFonts w:ascii="Courier New" w:hAnsi="Courier New" w:cs="Courier New" w:hint="default"/>
+      </w:rPr>
+    </w:lvl>
+    <w:lvl w:ilvl="8" w:tplc="04090005" w:tentative="1">
+      <w:start w:val="1"/>
+      <w:numFmt w:val="bullet"/>
+      <w:lvlText w:val=""/>
+      <w:lvlJc w:val="left"/>
+      <w:pPr>
+        <w:ind w:left="6480" w:hanging="360"/>
+      </w:pPr>
+      <w:rPr>
+        <w:rFonts w:ascii="Wingdings" w:hAnsi="Wingdings" w:hint="default"/>
+      </w:rPr>
+    </w:lvl>
+  </w:abstractNum>
+  <w:abstractNum w:abstractNumId="5" w15:restartNumberingAfterBreak="0">
+    <w:nsid w:val="5A8F70D2"/>
+    <w:multiLevelType w:val="hybridMultilevel"/>
+    <w:tmpl w:val="0ED673D2"/>
+    <w:lvl w:ilvl="0" w:tplc="04090001">
+      <w:start w:val="1"/>
+      <w:numFmt w:val="bullet"/>
+      <w:lvlText w:val=""/>
+      <w:lvlJc w:val="left"/>
+      <w:pPr>
+        <w:ind w:left="720" w:hanging="360"/>
+      </w:pPr>
+      <w:rPr>
+        <w:rFonts w:ascii="Symbol" w:hAnsi="Symbol" w:hint="default"/>
+      </w:rPr>
+    </w:lvl>
+    <w:lvl w:ilvl="1" w:tplc="04090003" w:tentative="1">
+      <w:start w:val="1"/>
+      <w:numFmt w:val="bullet"/>
+      <w:lvlText w:val="o"/>
+      <w:lvlJc w:val="left"/>
+      <w:pPr>
+        <w:ind w:left="1440" w:hanging="360"/>
+      </w:pPr>
+      <w:rPr>
+        <w:rFonts w:ascii="Courier New" w:hAnsi="Courier New" w:cs="Courier New" w:hint="default"/>
+      </w:rPr>
+    </w:lvl>
+    <w:lvl w:ilvl="2" w:tplc="04090005" w:tentative="1">
+      <w:start w:val="1"/>
+      <w:numFmt w:val="bullet"/>
+      <w:lvlText w:val=""/>
+      <w:lvlJc w:val="left"/>
+      <w:pPr>
+        <w:ind w:left="2160" w:hanging="360"/>
+      </w:pPr>
+      <w:rPr>
+        <w:rFonts w:ascii="Wingdings" w:hAnsi="Wingdings" w:hint="default"/>
+      </w:rPr>
+    </w:lvl>
+    <w:lvl w:ilvl="3" w:tplc="04090001" w:tentative="1">
+      <w:start w:val="1"/>
+      <w:numFmt w:val="bullet"/>
+      <w:lvlText w:val=""/>
+      <w:lvlJc w:val="left"/>
+      <w:pPr>
+        <w:ind w:left="2880" w:hanging="360"/>
+      </w:pPr>
+      <w:rPr>
+        <w:rFonts w:ascii="Symbol" w:hAnsi="Symbol" w:hint="default"/>
+      </w:rPr>
+    </w:lvl>
+    <w:lvl w:ilvl="4" w:tplc="04090003" w:tentative="1">
+      <w:start w:val="1"/>
+      <w:numFmt w:val="bullet"/>
+      <w:lvlText w:val="o"/>
+      <w:lvlJc w:val="left"/>
+      <w:pPr>
+        <w:ind w:left="3600" w:hanging="360"/>
+      </w:pPr>
+      <w:rPr>
+        <w:rFonts w:ascii="Courier New" w:hAnsi="Courier New" w:cs="Courier New" w:hint="default"/>
+      </w:rPr>
+    </w:lvl>
+    <w:lvl w:ilvl="5" w:tplc="04090005" w:tentative="1">
+      <w:start w:val="1"/>
+      <w:numFmt w:val="bullet"/>
+      <w:lvlText w:val=""/>
+      <w:lvlJc w:val="left"/>
+      <w:pPr>
+        <w:ind w:left="4320" w:hanging="360"/>
+      </w:pPr>
+      <w:rPr>
+        <w:rFonts w:ascii="Wingdings" w:hAnsi="Wingdings" w:hint="default"/>
+      </w:rPr>
+    </w:lvl>
+    <w:lvl w:ilvl="6" w:tplc="04090001" w:tentative="1">
+      <w:start w:val="1"/>
+      <w:numFmt w:val="bullet"/>
+      <w:lvlText w:val=""/>
+      <w:lvlJc w:val="left"/>
+      <w:pPr>
+        <w:ind w:left="5040" w:hanging="360"/>
+      </w:pPr>
+      <w:rPr>
+        <w:rFonts w:ascii="Symbol" w:hAnsi="Symbol" w:hint="default"/>
+      </w:rPr>
+    </w:lvl>
+    <w:lvl w:ilvl="7" w:tplc="04090003" w:tentative="1">
+      <w:start w:val="1"/>
+      <w:numFmt w:val="bullet"/>
+      <w:lvlText w:val="o"/>
+      <w:lvlJc w:val="left"/>
+      <w:pPr>
+        <w:ind w:left="5760" w:hanging="360"/>
+      </w:pPr>
+      <w:rPr>
+        <w:rFonts w:ascii="Courier New" w:hAnsi="Courier New" w:cs="Courier New" w:hint="default"/>
+      </w:rPr>
+    </w:lvl>
+    <w:lvl w:ilvl="8" w:tplc="04090005" w:tentative="1">
+      <w:start w:val="1"/>
+      <w:numFmt w:val="bullet"/>
+      <w:lvlText w:val=""/>
+      <w:lvlJc w:val="left"/>
+      <w:pPr>
+        <w:ind w:left="6480" w:hanging="360"/>
+      </w:pPr>
+      <w:rPr>
+        <w:rFonts w:ascii="Wingdings" w:hAnsi="Wingdings" w:hint="default"/>
+      </w:rPr>
+    </w:lvl>
+  </w:abstractNum>
+  <w:abstractNum w:abstractNumId="6" w15:restartNumberingAfterBreak="0">
+    <w:nsid w:val="65400E2A"/>
+    <w:multiLevelType w:val="hybridMultilevel"/>
+    <w:tmpl w:val="3C7EFFB6"/>
+    <w:lvl w:ilvl="0" w:tplc="82209286">
+      <w:start w:val="1"/>
+      <w:numFmt w:val="decimal"/>
+      <w:lvlText w:val="%1."/>
+      <w:lvlJc w:val="left"/>
+      <w:pPr>
+        <w:ind w:left="720" w:hanging="360"/>
+      </w:pPr>
+      <w:rPr>
+        <w:rFonts w:ascii="Arial" w:hAnsi="Arial" w:cs="Arial" w:hint="default"/>
+        <w:b w:val="0"/>
+        <w:bCs w:val="0"/>
+      </w:rPr>
+    </w:lvl>
+    <w:lvl w:ilvl="1" w:tplc="04090019" w:tentative="1">
+      <w:start w:val="1"/>
+      <w:numFmt w:val="lowerLetter"/>
+      <w:lvlText w:val="%2."/>
+      <w:lvlJc w:val="left"/>
+      <w:pPr>
+        <w:ind w:left="1440" w:hanging="360"/>
+      </w:pPr>
+    </w:lvl>
+    <w:lvl w:ilvl="2" w:tplc="0409001B" w:tentative="1">
+      <w:start w:val="1"/>
+      <w:numFmt w:val="lowerRoman"/>
+      <w:lvlText w:val="%3."/>
+      <w:lvlJc w:val="right"/>
+      <w:pPr>
+        <w:ind w:left="2160" w:hanging="180"/>
+      </w:pPr>
+    </w:lvl>
+    <w:lvl w:ilvl="3" w:tplc="0409000F" w:tentative="1">
+      <w:start w:val="1"/>
+      <w:numFmt w:val="decimal"/>
+      <w:lvlText w:val="%4."/>
+      <w:lvlJc w:val="left"/>
+      <w:pPr>
+        <w:ind w:left="2880" w:hanging="360"/>
+      </w:pPr>
+    </w:lvl>
+    <w:lvl w:ilvl="4" w:tplc="04090019" w:tentative="1">
+      <w:start w:val="1"/>
+      <w:numFmt w:val="lowerLetter"/>
+      <w:lvlText w:val="%5."/>
+      <w:lvlJc w:val="left"/>
+      <w:pPr>
+        <w:ind w:left="3600" w:hanging="360"/>
+      </w:pPr>
+    </w:lvl>
+    <w:lvl w:ilvl="5" w:tplc="0409001B" w:tentative="1">
+      <w:start w:val="1"/>
+      <w:numFmt w:val="lowerRoman"/>
+      <w:lvlText w:val="%6."/>
+      <w:lvlJc w:val="right"/>
+      <w:pPr>
+        <w:ind w:left="4320" w:hanging="180"/>
+      </w:pPr>
+    </w:lvl>
+    <w:lvl w:ilvl="6" w:tplc="0409000F" w:tentative="1">
+      <w:start w:val="1"/>
+      <w:numFmt w:val="decimal"/>
+      <w:lvlText w:val="%7."/>
+      <w:lvlJc w:val="left"/>
+      <w:pPr>
+        <w:ind w:left="5040" w:hanging="360"/>
+      </w:pPr>
+    </w:lvl>
+    <w:lvl w:ilvl="7" w:tplc="04090019" w:tentative="1">
+      <w:start w:val="1"/>
+      <w:numFmt w:val="lowerLetter"/>
+      <w:lvlText w:val="%8."/>
+      <w:lvlJc w:val="left"/>
+      <w:pPr>
+        <w:ind w:left="5760" w:hanging="360"/>
+      </w:pPr>
+    </w:lvl>
+    <w:lvl w:ilvl="8" w:tplc="0409001B" w:tentative="1">
+      <w:start w:val="1"/>
+      <w:numFmt w:val="lowerRoman"/>
+      <w:lvlText w:val="%9."/>
+      <w:lvlJc w:val="right"/>
+      <w:pPr>
+        <w:ind w:left="6480" w:hanging="180"/>
+      </w:pPr>
+    </w:lvl>
+  </w:abstractNum>
   <w:num w:numId="1" w16cid:durableId="1039816026">
+    <w:abstractNumId w:val="1"/>
+  </w:num>
+  <w:num w:numId="2" w16cid:durableId="1702315015">
+    <w:abstractNumId w:val="6"/>
+  </w:num>
+  <w:num w:numId="3" w16cid:durableId="1333558540">
+    <w:abstractNumId w:val="3"/>
+  </w:num>
+  <w:num w:numId="4" w16cid:durableId="284192495">
+    <w:abstractNumId w:val="5"/>
+  </w:num>
+  <w:num w:numId="5" w16cid:durableId="169024705">
     <w:abstractNumId w:val="0"/>
+  </w:num>
+  <w:num w:numId="6" w16cid:durableId="1526090630">
+    <w:abstractNumId w:val="2"/>
+  </w:num>
+  <w:num w:numId="7" w16cid:durableId="460921608">
+    <w:abstractNumId w:val="4"/>
   </w:num>
 </w:numbering>
 </file>
 
 <file path=word/styles.xml><?xml version="1.0" encoding="utf-8"?>
-<w:styles xmlns:mc="http://schemas.openxmlformats.org/markup-compatibility/2006" xmlns:r="http://schemas.openxmlformats.org/officeDocument/2006/relationships" xmlns:w="http://schemas.openxmlformats.org/wordprocessingml/2006/main" xmlns:w14="http://schemas.microsoft.com/office/word/2010/wordml" xmlns:w15="http://schemas.microsoft.com/office/word/2012/wordml" xmlns:w16cex="http://schemas.microsoft.com/office/word/2018/wordml/cex" xmlns:w16cid="http://schemas.microsoft.com/office/word/2016/wordml/cid" xmlns:w16="http://schemas.microsoft.com/office/word/2018/wordml" xmlns:w16sdtdh="http://schemas.microsoft.com/office/word/2020/wordml/sdtdatahash" xmlns:w16se="http://schemas.microsoft.com/office/word/2015/wordml/symex" mc:Ignorable="w14 w15 w16se w16cid w16 w16cex w16sdtdh">
+<w:styles xmlns:mc="http://schemas.openxmlformats.org/markup-compatibility/2006" xmlns:r="http://schemas.openxmlformats.org/officeDocument/2006/relationships" xmlns:w="http://schemas.openxmlformats.org/wordprocessingml/2006/main" xmlns:w14="http://schemas.microsoft.com/office/word/2010/wordml" xmlns:w15="http://schemas.microsoft.com/office/word/2012/wordml" xmlns:w16cex="http://schemas.microsoft.com/office/word/2018/wordml/cex" xmlns:w16cid="http://schemas.microsoft.com/office/word/2016/wordml/cid" xmlns:w16="http://schemas.microsoft.com/office/word/2018/wordml" xmlns:w16du="http://schemas.microsoft.com/office/word/2023/wordml/word16du" xmlns:w16sdtdh="http://schemas.microsoft.com/office/word/2020/wordml/sdtdatahash" xmlns:w16sdtfl="http://schemas.microsoft.com/office/word/2024/wordml/sdtformatlock" xmlns:w16se="http://schemas.microsoft.com/office/word/2015/wordml/symex" mc:Ignorable="w14 w15 w16se w16cid w16 w16cex w16sdtdh w16sdtfl w16du">
   <w:docDefaults>
     <w:rPrDefault>
       <w:rPr>
@@ -2390,7 +4256,6 @@
     <w:basedOn w:val="Normal"/>
     <w:next w:val="Normal"/>
     <w:uiPriority w:val="9"/>
-    <w:semiHidden/>
     <w:unhideWhenUsed/>
     <w:qFormat/>
     <w:pPr>
@@ -2672,6 +4537,21 @@
     <w:semiHidden/>
     <w:unhideWhenUsed/>
     <w:rsid w:val="00CC619C"/>
+  </w:style>
+  <w:style w:type="paragraph" w:customStyle="1" w:styleId="Note">
+    <w:name w:val="Note"/>
+    <w:basedOn w:val="Normal"/>
+    <w:qFormat/>
+    <w:rsid w:val="00C66FF0"/>
+    <w:pPr>
+      <w:spacing w:after="240"/>
+      <w:ind w:left="806" w:hanging="806"/>
+      <w:jc w:val="both"/>
+    </w:pPr>
+    <w:rPr>
+      <w:rFonts w:eastAsia="Times New Roman"/>
+      <w:lang w:val="en-US"/>
+    </w:rPr>
   </w:style>
 </w:styles>
 </file>

</xml_diff>

<commit_message>
Updated Currently Used Deprecated Functions Document (added updated build report to incorporate scan activity) / Updated Deprecated Functions - Incorporate Scan (added updated build report to incorporate scan activity)
</commit_message>
<xml_diff>
--- a/source/reference_documents/secondary_documents/implementation phase/Currently Used Deprecated Functions Document/Currently Used Deprecated Functions Document.docx
+++ b/source/reference_documents/secondary_documents/implementation phase/Currently Used Deprecated Functions Document/Currently Used Deprecated Functions Document.docx
@@ -28,7 +28,7 @@
         <w:t xml:space="preserve">Version </w:t>
       </w:r>
       <w:r>
-        <w:t>5</w:t>
+        <w:t>6</w:t>
       </w:r>
     </w:p>
     <w:p>
@@ -45,7 +45,7 @@
         <w:rPr>
           <w:noProof/>
         </w:rPr>
-        <w:t>2/25/26 8:23 AM</w:t>
+        <w:t>4/7/26 8:05 AM</w:t>
       </w:r>
       <w:r>
         <w:fldChar w:fldCharType="end"/>
@@ -504,8 +504,8 @@
           <w:noProof/>
         </w:rPr>
         <w:drawing>
-          <wp:inline distT="0" distB="0" distL="0" distR="0" wp14:anchorId="415B7DAB" wp14:editId="30849A1A">
-            <wp:extent cx="5931192" cy="1747491"/>
+          <wp:inline distT="0" distB="0" distL="0" distR="0" wp14:anchorId="415B7DAB" wp14:editId="02830FE9">
+            <wp:extent cx="5931190" cy="1747491"/>
             <wp:effectExtent l="0" t="0" r="0" b="5715"/>
             <wp:docPr id="1" name="Picture 1"/>
             <wp:cNvGraphicFramePr>
@@ -533,7 +533,7 @@
                   <pic:spPr>
                     <a:xfrm>
                       <a:off x="0" y="0"/>
-                      <a:ext cx="5931192" cy="1747491"/>
+                      <a:ext cx="5931190" cy="1747491"/>
                     </a:xfrm>
                     <a:prstGeom prst="rect">
                       <a:avLst/>
@@ -998,7 +998,7 @@
     </w:p>
     <w:tbl>
       <w:tblPr>
-        <w:tblW w:w="3860" w:type="dxa"/>
+        <w:tblW w:w="4760" w:type="dxa"/>
         <w:tblBorders>
           <w:top w:val="single" w:sz="8" w:space="0" w:color="000000"/>
           <w:left w:val="single" w:sz="8" w:space="0" w:color="000000"/>
@@ -1012,7 +1012,7 @@
       </w:tblPr>
       <w:tblGrid>
         <w:gridCol w:w="1520"/>
-        <w:gridCol w:w="2340"/>
+        <w:gridCol w:w="3240"/>
       </w:tblGrid>
       <w:tr>
         <w:tc>
@@ -1054,7 +1054,7 @@
         </w:tc>
         <w:tc>
           <w:tcPr>
-            <w:tcW w:w="2340" w:type="dxa"/>
+            <w:tcW w:w="3240" w:type="dxa"/>
             <w:tcMar>
               <w:top w:w="100" w:type="dxa"/>
               <w:left w:w="100" w:type="dxa"/>
@@ -1152,7 +1152,7 @@
         </w:tc>
         <w:tc>
           <w:tcPr>
-            <w:tcW w:w="2340" w:type="dxa"/>
+            <w:tcW w:w="3240" w:type="dxa"/>
             <w:tcMar>
               <w:top w:w="100" w:type="dxa"/>
               <w:left w:w="100" w:type="dxa"/>
@@ -1174,6 +1174,22 @@
             </w:pPr>
             <w:r>
               <w:t>Updated build file</w:t>
+            </w:r>
+          </w:p>
+          <w:p>
+            <w:pPr>
+              <w:widowControl w:val="0"/>
+              <w:pBdr>
+                <w:top w:val="nil"/>
+                <w:left w:val="nil"/>
+                <w:bottom w:val="nil"/>
+                <w:right w:val="nil"/>
+                <w:between w:val="nil"/>
+              </w:pBdr>
+              <w:spacing w:line="240" w:lineRule="auto"/>
+            </w:pPr>
+            <w:r>
+              <w:t>Updated build settings report</w:t>
             </w:r>
           </w:p>
         </w:tc>
@@ -1218,7 +1234,7 @@
         </w:tc>
         <w:tc>
           <w:tcPr>
-            <w:tcW w:w="2340" w:type="dxa"/>
+            <w:tcW w:w="3240" w:type="dxa"/>
             <w:tcMar>
               <w:top w:w="100" w:type="dxa"/>
               <w:left w:w="100" w:type="dxa"/>
@@ -1255,8 +1271,8 @@
           <w:noProof/>
         </w:rPr>
         <w:drawing>
-          <wp:inline distT="0" distB="0" distL="0" distR="0" wp14:anchorId="0B7A1613" wp14:editId="082B9E67">
-            <wp:extent cx="4491732" cy="4396897"/>
+          <wp:inline distT="0" distB="0" distL="0" distR="0" wp14:anchorId="0B7A1613" wp14:editId="1BA42097">
+            <wp:extent cx="4491732" cy="4396896"/>
             <wp:effectExtent l="0" t="0" r="4445" b="0"/>
             <wp:docPr id="4" name="Picture 4"/>
             <wp:cNvGraphicFramePr>
@@ -1284,7 +1300,7 @@
                   <pic:spPr>
                     <a:xfrm>
                       <a:off x="0" y="0"/>
-                      <a:ext cx="4491732" cy="4396897"/>
+                      <a:ext cx="4491732" cy="4396896"/>
                     </a:xfrm>
                     <a:prstGeom prst="rect">
                       <a:avLst/>
@@ -1384,16 +1400,111 @@
       <w:r>
         <w:t>.</w:t>
       </w:r>
-    </w:p>
-    <w:p>
-      <w:pPr>
-        <w:rPr>
-          <w:sz w:val="32"/>
-          <w:szCs w:val="32"/>
-        </w:rPr>
-      </w:pPr>
-      <w:r>
-        <w:br w:type="page"/>
+      <w:r>
+        <w:t xml:space="preserve"> If the build settings are changed, an </w:t>
+      </w:r>
+      <w:r>
+        <w:rPr>
+          <w:b/>
+          <w:bCs/>
+        </w:rPr>
+        <w:t>updated build settings report</w:t>
+      </w:r>
+      <w:r>
+        <w:t xml:space="preserve"> is generated.</w:t>
+      </w:r>
+    </w:p>
+    <w:p>
+      <w:pPr>
+        <w:pStyle w:val="Note"/>
+      </w:pPr>
+      <w:r>
+        <w:rPr>
+          <w:b/>
+          <w:bCs/>
+          <w:color w:val="0070C0"/>
+        </w:rPr>
+        <w:t>Note:</w:t>
+      </w:r>
+      <w:r>
+        <w:tab/>
+      </w:r>
+      <w:r>
+        <w:t xml:space="preserve">Alterations to the build settings should be implemented in alignment with the </w:t>
+      </w:r>
+      <w:r>
+        <w:rPr>
+          <w:b/>
+          <w:bCs/>
+        </w:rPr>
+        <w:t xml:space="preserve">Secure Setting Document </w:t>
+      </w:r>
+      <w:r>
+        <w:rPr>
+          <w:b/>
+          <w:bCs/>
+          <w:color w:val="0070C0"/>
+          <w:vertAlign w:val="superscript"/>
+        </w:rPr>
+        <w:t>[</w:t>
+      </w:r>
+      <w:r>
+        <w:rPr>
+          <w:b/>
+          <w:bCs/>
+          <w:color w:val="0070C0"/>
+          <w:vertAlign w:val="superscript"/>
+        </w:rPr>
+        <w:t>4</w:t>
+      </w:r>
+      <w:r>
+        <w:rPr>
+          <w:b/>
+          <w:bCs/>
+          <w:color w:val="0070C0"/>
+          <w:vertAlign w:val="superscript"/>
+        </w:rPr>
+        <w:t>]</w:t>
+      </w:r>
+      <w:r>
+        <w:t xml:space="preserve"> AVCDL secondary document, specifically the </w:t>
+      </w:r>
+      <w:r>
+        <w:rPr>
+          <w:b/>
+          <w:bCs/>
+        </w:rPr>
+        <w:t xml:space="preserve">Secure Settings – Apply Options Procedure </w:t>
+      </w:r>
+      <w:r>
+        <w:rPr>
+          <w:b/>
+          <w:bCs/>
+          <w:color w:val="0070C0"/>
+          <w:vertAlign w:val="superscript"/>
+        </w:rPr>
+        <w:t>[</w:t>
+      </w:r>
+      <w:r>
+        <w:rPr>
+          <w:b/>
+          <w:bCs/>
+          <w:color w:val="0070C0"/>
+          <w:vertAlign w:val="superscript"/>
+        </w:rPr>
+        <w:t>5</w:t>
+      </w:r>
+      <w:r>
+        <w:rPr>
+          <w:b/>
+          <w:bCs/>
+          <w:color w:val="0070C0"/>
+          <w:vertAlign w:val="superscript"/>
+        </w:rPr>
+        <w:t>]</w:t>
+      </w:r>
+      <w:r>
+        <w:t xml:space="preserve"> AVCDL tertiary document.</w:t>
       </w:r>
     </w:p>
     <w:p>
@@ -2843,6 +2954,69 @@
       </w:r>
       <w:r>
         <w:t>secondary</w:t>
+      </w:r>
+      <w:r>
+        <w:t xml:space="preserve"> document)</w:t>
+      </w:r>
+    </w:p>
+    <w:p>
+      <w:pPr>
+        <w:pStyle w:val="ListParagraph"/>
+        <w:numPr>
+          <w:ilvl w:val="0"/>
+          <w:numId w:val="1"/>
+        </w:numPr>
+        <w:ind w:left="360"/>
+        <w:jc w:val="both"/>
+        <w:rPr>
+          <w:b/>
+          <w:bCs/>
+        </w:rPr>
+      </w:pPr>
+      <w:r>
+        <w:rPr>
+          <w:b/>
+          <w:bCs/>
+        </w:rPr>
+        <w:t>Secure Settings</w:t>
+      </w:r>
+      <w:r>
+        <w:rPr>
+          <w:b/>
+          <w:bCs/>
+        </w:rPr>
+        <w:t xml:space="preserve"> Document </w:t>
+      </w:r>
+      <w:r>
+        <w:t>(AVCDL secondary document)</w:t>
+      </w:r>
+    </w:p>
+    <w:p>
+      <w:pPr>
+        <w:pStyle w:val="ListParagraph"/>
+        <w:numPr>
+          <w:ilvl w:val="0"/>
+          <w:numId w:val="1"/>
+        </w:numPr>
+        <w:ind w:left="360"/>
+        <w:jc w:val="both"/>
+        <w:rPr>
+          <w:b/>
+          <w:bCs/>
+        </w:rPr>
+      </w:pPr>
+      <w:r>
+        <w:rPr>
+          <w:b/>
+          <w:bCs/>
+        </w:rPr>
+        <w:t xml:space="preserve">Secure Settings – Apply Options Procedure </w:t>
+      </w:r>
+      <w:r>
+        <w:t xml:space="preserve">(AVCDL </w:t>
+      </w:r>
+      <w:r>
+        <w:t>tertiary</w:t>
       </w:r>
       <w:r>
         <w:t xml:space="preserve"> document)</w:t>

</xml_diff>

<commit_message>
Updated the Currently Used Deprecated Functions Document secondary document (error in report description text)
</commit_message>
<xml_diff>
--- a/source/reference_documents/secondary_documents/implementation phase/Currently Used Deprecated Functions Document/Currently Used Deprecated Functions Document.docx
+++ b/source/reference_documents/secondary_documents/implementation phase/Currently Used Deprecated Functions Document/Currently Used Deprecated Functions Document.docx
@@ -28,7 +28,7 @@
         <w:t xml:space="preserve">Version </w:t>
       </w:r>
       <w:r>
-        <w:t>6</w:t>
+        <w:t>7</w:t>
       </w:r>
     </w:p>
     <w:p>
@@ -45,7 +45,7 @@
         <w:rPr>
           <w:noProof/>
         </w:rPr>
-        <w:t>4/7/26 8:05 AM</w:t>
+        <w:t>4/13/26 1:28 PM</w:t>
       </w:r>
       <w:r>
         <w:fldChar w:fldCharType="end"/>
@@ -2581,7 +2581,31 @@
         <w:t>ssues</w:t>
       </w:r>
       <w:r>
-        <w:t xml:space="preserve"> artifact and should detail the issues exposed by the static analysis.</w:t>
+        <w:t xml:space="preserve"> artifact and should detail the </w:t>
+      </w:r>
+      <w:r>
+        <w:t>deprecated functions (issues)</w:t>
+      </w:r>
+      <w:r>
+        <w:t xml:space="preserve"> </w:t>
+      </w:r>
+      <w:r>
+        <w:t>identified</w:t>
+      </w:r>
+      <w:r>
+        <w:t xml:space="preserve"> </w:t>
+      </w:r>
+      <w:r>
+        <w:t>in</w:t>
+      </w:r>
+      <w:r>
+        <w:t xml:space="preserve"> the </w:t>
+      </w:r>
+      <w:r>
+        <w:t>scan (analysis)</w:t>
+      </w:r>
+      <w:r>
+        <w:t>.</w:t>
       </w:r>
     </w:p>
     <w:p>

</xml_diff>